<commit_message>
Expand learner performance dashboard recommendations
</commit_message>
<xml_diff>
--- a/docs/CLIENT-JOURNEY-UX-REVIEW-2026-09-07.docx
+++ b/docs/CLIENT-JOURNEY-UX-REVIEW-2026-09-07.docx
@@ -28,7 +28,7 @@
         </w:p>
       </w:sdtContent>
     </w:sdt>
-    <w:bookmarkStart w:id="27" w:name="X31edbf0c8689b3ad19cb239b9aa0d2ec181b7cf"/>
+    <w:bookmarkStart w:id="42" w:name="X31edbf0c8689b3ad19cb239b9aa0d2ec181b7cf"/>
     <w:p>
       <w:pPr>
         <w:pStyle w:val="Heading1"/>
@@ -1233,7 +1233,7 @@
       </w:r>
     </w:p>
     <w:bookmarkEnd w:id="16"/>
-    <w:bookmarkStart w:id="20" w:name="recommended-ux-test-plan"/>
+    <w:bookmarkStart w:id="19" w:name="X0a0351903deaa7408cbec9d6d618bdf3ccd68fe"/>
     <w:p>
       <w:pPr>
         <w:pStyle w:val="Heading2"/>
@@ -1248,10 +1248,941 @@
         <w:tab/>
       </w:r>
       <w:r>
+        <w:t xml:space="preserve">Is the current performance dashboard useful?</w:t>
+      </w:r>
+    </w:p>
+    <w:p>
+      <w:pPr>
+        <w:pStyle w:val="FirstParagraph"/>
+      </w:pPr>
+      <w:r>
+        <w:rPr>
+          <w:b/>
+          <w:bCs/>
+        </w:rPr>
+        <w:t xml:space="preserve">Yes for history, but only partly for improvement.</w:t>
+      </w:r>
+      <w:r>
+        <w:t xml:space="preserve"> </w:t>
+      </w:r>
+      <w:r>
+        <w:t xml:space="preserve">The present dashboard tells users how many tests they completed, their average and best score, recent results, and a basic trend. Detailed answer explanations are particularly valuable.</w:t>
+      </w:r>
+    </w:p>
+    <w:p>
+      <w:pPr>
+        <w:pStyle w:val="BodyText"/>
+      </w:pPr>
+      <w:r>
+        <w:t xml:space="preserve">However, average and best score alone do not tell a candidate whether their knowledge is broad, stable, well-paced, or retained. A high score may come from a short test or memorized retake. The dashboard currently cannot identify late-exam fatigue, repeated misconceptions, unseen syllabus areas, or whether the user is answering quickly enough under realistic conditions.</w:t>
+      </w:r>
+    </w:p>
+    <w:p>
+      <w:pPr>
+        <w:pStyle w:val="BodyText"/>
+      </w:pPr>
+      <w:r>
+        <w:t xml:space="preserve">PMI does not publish one universal percentage that PM Exam Pro can responsibly present as the official passing score. PMI says its passing standard is established through psychometric analysis and reports diagnostic performance by domain. PM Exam Pro should therefore use a clearly labelled</w:t>
+      </w:r>
+      <w:r>
+        <w:t xml:space="preserve"> </w:t>
+      </w:r>
+      <w:r>
+        <w:rPr>
+          <w:b/>
+          <w:bCs/>
+        </w:rPr>
+        <w:t xml:space="preserve">practice target/readiness indicator</w:t>
+      </w:r>
+      <w:r>
+        <w:t xml:space="preserve">, never a guaranteed pass prediction. Sources:</w:t>
+      </w:r>
+      <w:r>
+        <w:t xml:space="preserve"> </w:t>
+      </w:r>
+      <w:hyperlink r:id="rId17">
+        <w:r>
+          <w:rPr>
+            <w:rStyle w:val="Hyperlink"/>
+          </w:rPr>
+          <w:t xml:space="preserve">PMI Certification Handbook</w:t>
+        </w:r>
+      </w:hyperlink>
+      <w:r>
+        <w:t xml:space="preserve"> </w:t>
+      </w:r>
+      <w:r>
+        <w:t xml:space="preserve">and</w:t>
+      </w:r>
+      <w:r>
+        <w:t xml:space="preserve"> </w:t>
+      </w:r>
+      <w:hyperlink r:id="rId18">
+        <w:r>
+          <w:rPr>
+            <w:rStyle w:val="Hyperlink"/>
+          </w:rPr>
+          <w:t xml:space="preserve">sample PMI exam result report</w:t>
+        </w:r>
+      </w:hyperlink>
+      <w:r>
+        <w:t xml:space="preserve">.</w:t>
+      </w:r>
+    </w:p>
+    <w:bookmarkEnd w:id="19"/>
+    <w:bookmarkStart w:id="31" w:name="X10ec9f42471790dd4027a359be621fedbef4b9e"/>
+    <w:p>
+      <w:pPr>
+        <w:pStyle w:val="Heading2"/>
+      </w:pPr>
+      <w:r>
+        <w:rPr>
+          <w:rStyle w:val="SectionNumber"/>
+        </w:rPr>
+        <w:t xml:space="preserve">1.7</w:t>
+      </w:r>
+      <w:r>
+        <w:tab/>
+      </w:r>
+      <w:r>
+        <w:t xml:space="preserve">Performance features that help candidates improve</w:t>
+      </w:r>
+    </w:p>
+    <w:bookmarkStart w:id="20" w:name="give-one-clear-next-action"/>
+    <w:p>
+      <w:pPr>
+        <w:pStyle w:val="Heading3"/>
+      </w:pPr>
+      <w:r>
+        <w:rPr>
+          <w:rStyle w:val="SectionNumber"/>
+        </w:rPr>
+        <w:t xml:space="preserve">1.7.1</w:t>
+      </w:r>
+      <w:r>
+        <w:tab/>
+      </w:r>
+      <w:r>
+        <w:t xml:space="preserve">1. Give one clear next action</w:t>
+      </w:r>
+    </w:p>
+    <w:p>
+      <w:pPr>
+        <w:pStyle w:val="FirstParagraph"/>
+      </w:pPr>
+      <w:r>
+        <w:t xml:space="preserve">The first card should recommend the highest-value action based on evidence:</w:t>
+      </w:r>
+    </w:p>
+    <w:p>
+      <w:pPr>
+        <w:pStyle w:val="Compact"/>
+        <w:numPr>
+          <w:ilvl w:val="0"/>
+          <w:numId w:val="1007"/>
+        </w:numPr>
+      </w:pPr>
+      <w:r>
+        <w:t xml:space="preserve">Resume the current test.</w:t>
+      </w:r>
+    </w:p>
+    <w:p>
+      <w:pPr>
+        <w:pStyle w:val="Compact"/>
+        <w:numPr>
+          <w:ilvl w:val="0"/>
+          <w:numId w:val="1007"/>
+        </w:numPr>
+      </w:pPr>
+      <w:r>
+        <w:t xml:space="preserve">Review recurring mistakes.</w:t>
+      </w:r>
+    </w:p>
+    <w:p>
+      <w:pPr>
+        <w:pStyle w:val="Compact"/>
+        <w:numPr>
+          <w:ilvl w:val="0"/>
+          <w:numId w:val="1007"/>
+        </w:numPr>
+      </w:pPr>
+      <w:r>
+        <w:t xml:space="preserve">Practise the weakest official domain.</w:t>
+      </w:r>
+    </w:p>
+    <w:p>
+      <w:pPr>
+        <w:pStyle w:val="Compact"/>
+        <w:numPr>
+          <w:ilvl w:val="0"/>
+          <w:numId w:val="1007"/>
+        </w:numPr>
+      </w:pPr>
+      <w:r>
+        <w:t xml:space="preserve">Retest material that was previously missed after a suitable delay.</w:t>
+      </w:r>
+    </w:p>
+    <w:p>
+      <w:pPr>
+        <w:pStyle w:val="Compact"/>
+        <w:numPr>
+          <w:ilvl w:val="0"/>
+          <w:numId w:val="1007"/>
+        </w:numPr>
+      </w:pPr>
+      <w:r>
+        <w:t xml:space="preserve">Take a fresh full simulation when coverage and practice volume are sufficient.</w:t>
+      </w:r>
+    </w:p>
+    <w:bookmarkEnd w:id="20"/>
+    <w:bookmarkStart w:id="21" w:name="X0de50677ba598c5ff5abb2a1d14d07265c7898b"/>
+    <w:p>
+      <w:pPr>
+        <w:pStyle w:val="Heading3"/>
+      </w:pPr>
+      <w:r>
+        <w:rPr>
+          <w:rStyle w:val="SectionNumber"/>
+        </w:rPr>
+        <w:t xml:space="preserve">1.7.2</w:t>
+      </w:r>
+      <w:r>
+        <w:tab/>
+      </w:r>
+      <w:r>
+        <w:t xml:space="preserve">2. Measure current ability, not lifetime history</w:t>
+      </w:r>
+    </w:p>
+    <w:p>
+      <w:pPr>
+        <w:pStyle w:val="FirstParagraph"/>
+      </w:pPr>
+      <w:r>
+        <w:t xml:space="preserve">Use a weighted average of the last five comparable exam-mode attempts, giving more weight to recent attempts. Keep short quizzes, full simulations, and training attempts separate.</w:t>
+      </w:r>
+    </w:p>
+    <w:bookmarkEnd w:id="21"/>
+    <w:bookmarkStart w:id="22" w:name="show-first-seen-accuracy"/>
+    <w:p>
+      <w:pPr>
+        <w:pStyle w:val="Heading3"/>
+      </w:pPr>
+      <w:r>
+        <w:rPr>
+          <w:rStyle w:val="SectionNumber"/>
+        </w:rPr>
+        <w:t xml:space="preserve">1.7.3</w:t>
+      </w:r>
+      <w:r>
+        <w:tab/>
+      </w:r>
+      <w:r>
+        <w:t xml:space="preserve">3. Show first-seen accuracy</w:t>
+      </w:r>
+    </w:p>
+    <w:p>
+      <w:pPr>
+        <w:pStyle w:val="FirstParagraph"/>
+      </w:pPr>
+      <w:r>
+        <w:t xml:space="preserve">Report performance on questions the learner has not previously attempted. Keep retake improvement as a separate metric. This reduces false confidence caused by recognizing answers.</w:t>
+      </w:r>
+    </w:p>
+    <w:bookmarkEnd w:id="22"/>
+    <w:bookmarkStart w:id="25" w:name="Xbd9a04717df2858c33381055da1c9dac762d9ef"/>
+    <w:p>
+      <w:pPr>
+        <w:pStyle w:val="Heading3"/>
+      </w:pPr>
+      <w:r>
+        <w:rPr>
+          <w:rStyle w:val="SectionNumber"/>
+        </w:rPr>
+        <w:t xml:space="preserve">1.7.4</w:t>
+      </w:r>
+      <w:r>
+        <w:tab/>
+      </w:r>
+      <w:r>
+        <w:t xml:space="preserve">4. Align domain mastery to the official blueprint</w:t>
+      </w:r>
+    </w:p>
+    <w:p>
+      <w:pPr>
+        <w:pStyle w:val="FirstParagraph"/>
+      </w:pPr>
+      <w:r>
+        <w:t xml:space="preserve">Normalize all question tags and calculate results using the certification’s current content weights. The July 2026 PMP blueprint is People 33%, Process 41%, and Business Environment 26%, with predictive and adaptive/agile/hybrid approaches represented throughout. CAPM currently weights Fundamentals/Core Concepts 36%, Predictive 17%, Agile 20%, and Business Analysis 27%. Sources:</w:t>
+      </w:r>
+      <w:r>
+        <w:t xml:space="preserve"> </w:t>
+      </w:r>
+      <w:hyperlink r:id="rId23">
+        <w:r>
+          <w:rPr>
+            <w:rStyle w:val="Hyperlink"/>
+          </w:rPr>
+          <w:t xml:space="preserve">2026 PMP Examination Content Outline</w:t>
+        </w:r>
+      </w:hyperlink>
+      <w:r>
+        <w:t xml:space="preserve"> </w:t>
+      </w:r>
+      <w:r>
+        <w:t xml:space="preserve">and</w:t>
+      </w:r>
+      <w:r>
+        <w:t xml:space="preserve"> </w:t>
+      </w:r>
+      <w:hyperlink r:id="rId24">
+        <w:r>
+          <w:rPr>
+            <w:rStyle w:val="Hyperlink"/>
+          </w:rPr>
+          <w:t xml:space="preserve">PMI CAPM certification page</w:t>
+        </w:r>
+      </w:hyperlink>
+      <w:r>
+        <w:t xml:space="preserve">.</w:t>
+      </w:r>
+    </w:p>
+    <w:p>
+      <w:pPr>
+        <w:pStyle w:val="BodyText"/>
+      </w:pPr>
+      <w:r>
+        <w:t xml:space="preserve">Every domain should show accuracy, number of first-seen questions attempted, trend, and whether there is enough evidence. A domain based on only a few questions should display “insufficient evidence,” not a confident mastery label.</w:t>
+      </w:r>
+    </w:p>
+    <w:bookmarkEnd w:id="25"/>
+    <w:bookmarkStart w:id="27" w:name="add-time-management-and-stamina-metrics"/>
+    <w:p>
+      <w:pPr>
+        <w:pStyle w:val="Heading3"/>
+      </w:pPr>
+      <w:r>
+        <w:rPr>
+          <w:rStyle w:val="SectionNumber"/>
+        </w:rPr>
+        <w:t xml:space="preserve">1.7.5</w:t>
+      </w:r>
+      <w:r>
+        <w:tab/>
+      </w:r>
+      <w:r>
+        <w:t xml:space="preserve">5. Add time-management and stamina metrics</w:t>
+      </w:r>
+    </w:p>
+    <w:p>
+      <w:pPr>
+        <w:pStyle w:val="FirstParagraph"/>
+      </w:pPr>
+      <w:r>
+        <w:t xml:space="preserve">Capture a timestamp for each answer and show:</w:t>
+      </w:r>
+    </w:p>
+    <w:p>
+      <w:pPr>
+        <w:pStyle w:val="Compact"/>
+        <w:numPr>
+          <w:ilvl w:val="0"/>
+          <w:numId w:val="1008"/>
+        </w:numPr>
+      </w:pPr>
+      <w:r>
+        <w:t xml:space="preserve">Median time per question and projected finish time.</w:t>
+      </w:r>
+    </w:p>
+    <w:p>
+      <w:pPr>
+        <w:pStyle w:val="Compact"/>
+        <w:numPr>
+          <w:ilvl w:val="0"/>
+          <w:numId w:val="1008"/>
+        </w:numPr>
+      </w:pPr>
+      <w:r>
+        <w:t xml:space="preserve">Unanswered questions and questions answered during a final rush.</w:t>
+      </w:r>
+    </w:p>
+    <w:p>
+      <w:pPr>
+        <w:pStyle w:val="Compact"/>
+        <w:numPr>
+          <w:ilvl w:val="0"/>
+          <w:numId w:val="1008"/>
+        </w:numPr>
+      </w:pPr>
+      <w:r>
+        <w:t xml:space="preserve">Questions where the candidate became stuck.</w:t>
+      </w:r>
+    </w:p>
+    <w:p>
+      <w:pPr>
+        <w:pStyle w:val="Compact"/>
+        <w:numPr>
+          <w:ilvl w:val="0"/>
+          <w:numId w:val="1008"/>
+        </w:numPr>
+      </w:pPr>
+      <w:r>
+        <w:t xml:space="preserve">Accuracy and speed by quarter/section of the exam.</w:t>
+      </w:r>
+    </w:p>
+    <w:p>
+      <w:pPr>
+        <w:pStyle w:val="Compact"/>
+        <w:numPr>
+          <w:ilvl w:val="0"/>
+          <w:numId w:val="1008"/>
+        </w:numPr>
+      </w:pPr>
+      <w:r>
+        <w:t xml:space="preserve">Whether performance declines late in a full simulation.</w:t>
+      </w:r>
+    </w:p>
+    <w:p>
+      <w:pPr>
+        <w:pStyle w:val="FirstParagraph"/>
+      </w:pPr>
+      <w:r>
+        <w:t xml:space="preserve">This requires realistic simulations. PMI currently describes PMP as 180 questions in four hours with two 10-minute breaks, and CAPM as 150 questions in 180 minutes. PM Exam Pro’s current tests have 21–50 published questions but 180-minute limits, so they cannot yet provide meaningful full-exam pacing or stamina evidence. Sources:</w:t>
+      </w:r>
+      <w:r>
+        <w:t xml:space="preserve"> </w:t>
+      </w:r>
+      <w:hyperlink r:id="rId26">
+        <w:r>
+          <w:rPr>
+            <w:rStyle w:val="Hyperlink"/>
+          </w:rPr>
+          <w:t xml:space="preserve">PMI PMP certification page</w:t>
+        </w:r>
+      </w:hyperlink>
+      <w:r>
+        <w:t xml:space="preserve"> </w:t>
+      </w:r>
+      <w:r>
+        <w:t xml:space="preserve">and</w:t>
+      </w:r>
+      <w:r>
+        <w:t xml:space="preserve"> </w:t>
+      </w:r>
+      <w:hyperlink r:id="rId24">
+        <w:r>
+          <w:rPr>
+            <w:rStyle w:val="Hyperlink"/>
+          </w:rPr>
+          <w:t xml:space="preserve">PMI CAPM certification page</w:t>
+        </w:r>
+      </w:hyperlink>
+      <w:r>
+        <w:t xml:space="preserve">.</w:t>
+      </w:r>
+    </w:p>
+    <w:bookmarkEnd w:id="27"/>
+    <w:bookmarkStart w:id="28" w:name="track-consistency-coverage-and-retention"/>
+    <w:p>
+      <w:pPr>
+        <w:pStyle w:val="Heading3"/>
+      </w:pPr>
+      <w:r>
+        <w:rPr>
+          <w:rStyle w:val="SectionNumber"/>
+        </w:rPr>
+        <w:t xml:space="preserve">1.7.6</w:t>
+      </w:r>
+      <w:r>
+        <w:tab/>
+      </w:r>
+      <w:r>
+        <w:t xml:space="preserve">6. Track consistency, coverage, and retention</w:t>
+      </w:r>
+    </w:p>
+    <w:p>
+      <w:pPr>
+        <w:pStyle w:val="Compact"/>
+        <w:numPr>
+          <w:ilvl w:val="0"/>
+          <w:numId w:val="1009"/>
+        </w:numPr>
+      </w:pPr>
+      <w:r>
+        <w:rPr>
+          <w:b/>
+          <w:bCs/>
+        </w:rPr>
+        <w:t xml:space="preserve">Consistency:</w:t>
+      </w:r>
+      <w:r>
+        <w:t xml:space="preserve"> </w:t>
+      </w:r>
+      <w:r>
+        <w:t xml:space="preserve">average and score variation across the last three to five comparable full simulations.</w:t>
+      </w:r>
+    </w:p>
+    <w:p>
+      <w:pPr>
+        <w:pStyle w:val="Compact"/>
+        <w:numPr>
+          <w:ilvl w:val="0"/>
+          <w:numId w:val="1009"/>
+        </w:numPr>
+      </w:pPr>
+      <w:r>
+        <w:rPr>
+          <w:b/>
+          <w:bCs/>
+        </w:rPr>
+        <w:t xml:space="preserve">Coverage:</w:t>
+      </w:r>
+      <w:r>
+        <w:t xml:space="preserve"> </w:t>
+      </w:r>
+      <w:r>
+        <w:t xml:space="preserve">unique questions and official blueprint areas attempted.</w:t>
+      </w:r>
+    </w:p>
+    <w:p>
+      <w:pPr>
+        <w:pStyle w:val="Compact"/>
+        <w:numPr>
+          <w:ilvl w:val="0"/>
+          <w:numId w:val="1009"/>
+        </w:numPr>
+      </w:pPr>
+      <w:r>
+        <w:rPr>
+          <w:b/>
+          <w:bCs/>
+        </w:rPr>
+        <w:t xml:space="preserve">Retention:</w:t>
+      </w:r>
+      <w:r>
+        <w:t xml:space="preserve"> </w:t>
+      </w:r>
+      <w:r>
+        <w:t xml:space="preserve">accuracy when previously missed concepts return after several days.</w:t>
+      </w:r>
+    </w:p>
+    <w:p>
+      <w:pPr>
+        <w:pStyle w:val="Compact"/>
+        <w:numPr>
+          <w:ilvl w:val="0"/>
+          <w:numId w:val="1009"/>
+        </w:numPr>
+      </w:pPr>
+      <w:r>
+        <w:rPr>
+          <w:b/>
+          <w:bCs/>
+        </w:rPr>
+        <w:t xml:space="preserve">Recurring errors:</w:t>
+      </w:r>
+      <w:r>
+        <w:t xml:space="preserve"> </w:t>
+      </w:r>
+      <w:r>
+        <w:t xml:space="preserve">concepts or questions missed at least twice.</w:t>
+      </w:r>
+    </w:p>
+    <w:p>
+      <w:pPr>
+        <w:pStyle w:val="Compact"/>
+        <w:numPr>
+          <w:ilvl w:val="0"/>
+          <w:numId w:val="1009"/>
+        </w:numPr>
+      </w:pPr>
+      <w:r>
+        <w:rPr>
+          <w:b/>
+          <w:bCs/>
+        </w:rPr>
+        <w:t xml:space="preserve">Review effectiveness:</w:t>
+      </w:r>
+      <w:r>
+        <w:t xml:space="preserve"> </w:t>
+      </w:r>
+      <w:r>
+        <w:t xml:space="preserve">whether changing flagged answers usually helps or hurts.</w:t>
+      </w:r>
+    </w:p>
+    <w:p>
+      <w:pPr>
+        <w:pStyle w:val="Compact"/>
+        <w:numPr>
+          <w:ilvl w:val="0"/>
+          <w:numId w:val="1009"/>
+        </w:numPr>
+      </w:pPr>
+      <w:r>
+        <w:rPr>
+          <w:b/>
+          <w:bCs/>
+        </w:rPr>
+        <w:t xml:space="preserve">Confidence calibration:</w:t>
+      </w:r>
+      <w:r>
+        <w:t xml:space="preserve"> </w:t>
+      </w:r>
+      <w:r>
+        <w:t xml:space="preserve">optionally identify confident-but-wrong answers, which are the most dangerous misconceptions.</w:t>
+      </w:r>
+    </w:p>
+    <w:bookmarkEnd w:id="28"/>
+    <w:bookmarkStart w:id="29" w:name="X31b1e23002e8fedb5d6c179f7e52b391fa2a731"/>
+    <w:p>
+      <w:pPr>
+        <w:pStyle w:val="Heading3"/>
+      </w:pPr>
+      <w:r>
+        <w:rPr>
+          <w:rStyle w:val="SectionNumber"/>
+        </w:rPr>
+        <w:t xml:space="preserve">1.7.7</w:t>
+      </w:r>
+      <w:r>
+        <w:tab/>
+      </w:r>
+      <w:r>
+        <w:t xml:space="preserve">7. Introduce a transparent Practice Readiness Index</w:t>
+      </w:r>
+    </w:p>
+    <w:p>
+      <w:pPr>
+        <w:pStyle w:val="FirstParagraph"/>
+      </w:pPr>
+      <w:r>
+        <w:t xml:space="preserve">An initial coaching formula could be:</w:t>
+      </w:r>
+    </w:p>
+    <w:p>
+      <w:pPr>
+        <w:pStyle w:val="BodyText"/>
+      </w:pPr>
+      <w:r>
+        <w:rPr>
+          <w:rStyle w:val="VerbatimChar"/>
+        </w:rPr>
+        <w:t xml:space="preserve">35% recent performance + 30% blueprint mastery + 15% consistency + 10% pacing + 10% coverage</w:t>
+      </w:r>
+    </w:p>
+    <w:p>
+      <w:pPr>
+        <w:pStyle w:val="BodyText"/>
+      </w:pPr>
+      <w:r>
+        <w:t xml:space="preserve">This should:</w:t>
+      </w:r>
+    </w:p>
+    <w:p>
+      <w:pPr>
+        <w:pStyle w:val="Compact"/>
+        <w:numPr>
+          <w:ilvl w:val="0"/>
+          <w:numId w:val="1010"/>
+        </w:numPr>
+      </w:pPr>
+      <w:r>
+        <w:t xml:space="preserve">Appear only after at least two comparable full simulations and adequate domain coverage.</w:t>
+      </w:r>
+    </w:p>
+    <w:p>
+      <w:pPr>
+        <w:pStyle w:val="Compact"/>
+        <w:numPr>
+          <w:ilvl w:val="0"/>
+          <w:numId w:val="1010"/>
+        </w:numPr>
+      </w:pPr>
+      <w:r>
+        <w:t xml:space="preserve">Say “Not enough evidence yet” beforehand.</w:t>
+      </w:r>
+    </w:p>
+    <w:p>
+      <w:pPr>
+        <w:pStyle w:val="Compact"/>
+        <w:numPr>
+          <w:ilvl w:val="0"/>
+          <w:numId w:val="1010"/>
+        </w:numPr>
+      </w:pPr>
+      <w:r>
+        <w:t xml:space="preserve">Exclude training mode and discount repeated questions.</w:t>
+      </w:r>
+    </w:p>
+    <w:p>
+      <w:pPr>
+        <w:pStyle w:val="Compact"/>
+        <w:numPr>
+          <w:ilvl w:val="0"/>
+          <w:numId w:val="1010"/>
+        </w:numPr>
+      </w:pPr>
+      <w:r>
+        <w:t xml:space="preserve">Show each component and explain why the result changed.</w:t>
+      </w:r>
+    </w:p>
+    <w:p>
+      <w:pPr>
+        <w:pStyle w:val="Compact"/>
+        <w:numPr>
+          <w:ilvl w:val="0"/>
+          <w:numId w:val="1010"/>
+        </w:numPr>
+      </w:pPr>
+      <w:r>
+        <w:t xml:space="preserve">Be labelled as PM Exam Pro practice guidance, not an official PMI score or probability of passing.</w:t>
+      </w:r>
+    </w:p>
+    <w:p>
+      <w:pPr>
+        <w:pStyle w:val="Compact"/>
+        <w:numPr>
+          <w:ilvl w:val="0"/>
+          <w:numId w:val="1010"/>
+        </w:numPr>
+      </w:pPr>
+      <w:r>
+        <w:t xml:space="preserve">Be recalibrated later using consenting learners’ actual exam outcomes.</w:t>
+      </w:r>
+    </w:p>
+    <w:bookmarkEnd w:id="29"/>
+    <w:bookmarkStart w:id="30" w:name="recommended-dashboard-layout"/>
+    <w:p>
+      <w:pPr>
+        <w:pStyle w:val="Heading3"/>
+      </w:pPr>
+      <w:r>
+        <w:rPr>
+          <w:rStyle w:val="SectionNumber"/>
+        </w:rPr>
+        <w:t xml:space="preserve">1.7.8</w:t>
+      </w:r>
+      <w:r>
+        <w:tab/>
+      </w:r>
+      <w:r>
+        <w:t xml:space="preserve">Recommended dashboard layout</w:t>
+      </w:r>
+    </w:p>
+    <w:p>
+      <w:pPr>
+        <w:pStyle w:val="Compact"/>
+        <w:numPr>
+          <w:ilvl w:val="0"/>
+          <w:numId w:val="1011"/>
+        </w:numPr>
+      </w:pPr>
+      <w:r>
+        <w:rPr>
+          <w:b/>
+          <w:bCs/>
+        </w:rPr>
+        <w:t xml:space="preserve">Your next move</w:t>
+      </w:r>
+      <w:r>
+        <w:t xml:space="preserve"> </w:t>
+      </w:r>
+      <w:r>
+        <w:t xml:space="preserve">— one recommended action.</w:t>
+      </w:r>
+    </w:p>
+    <w:p>
+      <w:pPr>
+        <w:pStyle w:val="Compact"/>
+        <w:numPr>
+          <w:ilvl w:val="0"/>
+          <w:numId w:val="1011"/>
+        </w:numPr>
+      </w:pPr>
+      <w:r>
+        <w:rPr>
+          <w:b/>
+          <w:bCs/>
+        </w:rPr>
+        <w:t xml:space="preserve">Practice readiness</w:t>
+      </w:r>
+      <w:r>
+        <w:t xml:space="preserve"> </w:t>
+      </w:r>
+      <w:r>
+        <w:t xml:space="preserve">— transparent index and evidence quality.</w:t>
+      </w:r>
+    </w:p>
+    <w:p>
+      <w:pPr>
+        <w:pStyle w:val="Compact"/>
+        <w:numPr>
+          <w:ilvl w:val="0"/>
+          <w:numId w:val="1011"/>
+        </w:numPr>
+      </w:pPr>
+      <w:r>
+        <w:rPr>
+          <w:b/>
+          <w:bCs/>
+        </w:rPr>
+        <w:t xml:space="preserve">Weakest domains</w:t>
+      </w:r>
+      <w:r>
+        <w:t xml:space="preserve"> </w:t>
+      </w:r>
+      <w:r>
+        <w:t xml:space="preserve">— mastery, sample size, trend, and direct Practice buttons.</w:t>
+      </w:r>
+    </w:p>
+    <w:p>
+      <w:pPr>
+        <w:pStyle w:val="Compact"/>
+        <w:numPr>
+          <w:ilvl w:val="0"/>
+          <w:numId w:val="1011"/>
+        </w:numPr>
+      </w:pPr>
+      <w:r>
+        <w:rPr>
+          <w:b/>
+          <w:bCs/>
+        </w:rPr>
+        <w:t xml:space="preserve">Time and stamina</w:t>
+      </w:r>
+      <w:r>
+        <w:t xml:space="preserve"> </w:t>
+      </w:r>
+      <w:r>
+        <w:t xml:space="preserve">— pace, projected finish, and late-exam performance.</w:t>
+      </w:r>
+    </w:p>
+    <w:p>
+      <w:pPr>
+        <w:pStyle w:val="Compact"/>
+        <w:numPr>
+          <w:ilvl w:val="0"/>
+          <w:numId w:val="1011"/>
+        </w:numPr>
+      </w:pPr>
+      <w:r>
+        <w:rPr>
+          <w:b/>
+          <w:bCs/>
+        </w:rPr>
+        <w:t xml:space="preserve">Recurring mistakes</w:t>
+      </w:r>
+      <w:r>
+        <w:t xml:space="preserve"> </w:t>
+      </w:r>
+      <w:r>
+        <w:t xml:space="preserve">— high-priority review list.</w:t>
+      </w:r>
+    </w:p>
+    <w:p>
+      <w:pPr>
+        <w:pStyle w:val="Compact"/>
+        <w:numPr>
+          <w:ilvl w:val="0"/>
+          <w:numId w:val="1011"/>
+        </w:numPr>
+      </w:pPr>
+      <w:r>
+        <w:rPr>
+          <w:b/>
+          <w:bCs/>
+        </w:rPr>
+        <w:t xml:space="preserve">Coverage and retention</w:t>
+      </w:r>
+      <w:r>
+        <w:t xml:space="preserve"> </w:t>
+      </w:r>
+      <w:r>
+        <w:t xml:space="preserve">— unseen content and revision checks due.</w:t>
+      </w:r>
+    </w:p>
+    <w:p>
+      <w:pPr>
+        <w:pStyle w:val="Compact"/>
+        <w:numPr>
+          <w:ilvl w:val="0"/>
+          <w:numId w:val="1011"/>
+        </w:numPr>
+      </w:pPr>
+      <w:r>
+        <w:rPr>
+          <w:b/>
+          <w:bCs/>
+        </w:rPr>
+        <w:t xml:space="preserve">Exam plan</w:t>
+      </w:r>
+      <w:r>
+        <w:t xml:space="preserve"> </w:t>
+      </w:r>
+      <w:r>
+        <w:t xml:space="preserve">— days remaining and recommended weekly activity.</w:t>
+      </w:r>
+    </w:p>
+    <w:p>
+      <w:pPr>
+        <w:pStyle w:val="Compact"/>
+        <w:numPr>
+          <w:ilvl w:val="0"/>
+          <w:numId w:val="1011"/>
+        </w:numPr>
+      </w:pPr>
+      <w:r>
+        <w:rPr>
+          <w:b/>
+          <w:bCs/>
+        </w:rPr>
+        <w:t xml:space="preserve">Recent attempts</w:t>
+      </w:r>
+      <w:r>
+        <w:t xml:space="preserve"> </w:t>
+      </w:r>
+      <w:r>
+        <w:t xml:space="preserve">— comparable results with detailed review.</w:t>
+      </w:r>
+    </w:p>
+    <w:p>
+      <w:pPr>
+        <w:pStyle w:val="FirstParagraph"/>
+      </w:pPr>
+      <w:r>
+        <w:t xml:space="preserve">The key design rule is simple:</w:t>
+      </w:r>
+      <w:r>
+        <w:t xml:space="preserve"> </w:t>
+      </w:r>
+      <w:r>
+        <w:rPr>
+          <w:b/>
+          <w:bCs/>
+        </w:rPr>
+        <w:t xml:space="preserve">every prominent metric should tell the learner what to do next.</w:t>
+      </w:r>
+    </w:p>
+    <w:bookmarkEnd w:id="30"/>
+    <w:bookmarkEnd w:id="31"/>
+    <w:bookmarkStart w:id="35" w:name="recommended-ux-test-plan"/>
+    <w:p>
+      <w:pPr>
+        <w:pStyle w:val="Heading2"/>
+      </w:pPr>
+      <w:r>
+        <w:rPr>
+          <w:rStyle w:val="SectionNumber"/>
+        </w:rPr>
+        <w:t xml:space="preserve">1.8</w:t>
+      </w:r>
+      <w:r>
+        <w:tab/>
+      </w:r>
+      <w:r>
         <w:t xml:space="preserve">Recommended UX test plan</w:t>
       </w:r>
     </w:p>
-    <w:bookmarkStart w:id="17" w:name="moderated-usability-sessions"/>
+    <w:bookmarkStart w:id="32" w:name="moderated-usability-sessions"/>
     <w:p>
       <w:pPr>
         <w:pStyle w:val="Heading3"/>
@@ -1260,7 +2191,7 @@
         <w:rPr>
           <w:rStyle w:val="SectionNumber"/>
         </w:rPr>
-        <w:t xml:space="preserve">1.6.1</w:t>
+        <w:t xml:space="preserve">1.8.1</w:t>
       </w:r>
       <w:r>
         <w:tab/>
@@ -1282,7 +2213,7 @@
         <w:pStyle w:val="Compact"/>
         <w:numPr>
           <w:ilvl w:val="0"/>
-          <w:numId w:val="1007"/>
+          <w:numId w:val="1012"/>
         </w:numPr>
       </w:pPr>
       <w:r>
@@ -1294,7 +2225,7 @@
         <w:pStyle w:val="Compact"/>
         <w:numPr>
           <w:ilvl w:val="0"/>
-          <w:numId w:val="1007"/>
+          <w:numId w:val="1012"/>
         </w:numPr>
       </w:pPr>
       <w:r>
@@ -1306,7 +2237,7 @@
         <w:pStyle w:val="Compact"/>
         <w:numPr>
           <w:ilvl w:val="0"/>
-          <w:numId w:val="1007"/>
+          <w:numId w:val="1012"/>
         </w:numPr>
       </w:pPr>
       <w:r>
@@ -1318,7 +2249,7 @@
         <w:pStyle w:val="Compact"/>
         <w:numPr>
           <w:ilvl w:val="0"/>
-          <w:numId w:val="1007"/>
+          <w:numId w:val="1012"/>
         </w:numPr>
       </w:pPr>
       <w:r>
@@ -1330,7 +2261,7 @@
         <w:pStyle w:val="Compact"/>
         <w:numPr>
           <w:ilvl w:val="0"/>
-          <w:numId w:val="1007"/>
+          <w:numId w:val="1012"/>
         </w:numPr>
       </w:pPr>
       <w:r>
@@ -1342,7 +2273,7 @@
         <w:pStyle w:val="Compact"/>
         <w:numPr>
           <w:ilvl w:val="0"/>
-          <w:numId w:val="1007"/>
+          <w:numId w:val="1012"/>
         </w:numPr>
       </w:pPr>
       <w:r>
@@ -1354,7 +2285,7 @@
         <w:pStyle w:val="Compact"/>
         <w:numPr>
           <w:ilvl w:val="0"/>
-          <w:numId w:val="1007"/>
+          <w:numId w:val="1012"/>
         </w:numPr>
       </w:pPr>
       <w:r>
@@ -1369,8 +2300,8 @@
         <w:t xml:space="preserve">Measure task completion, first-click success, time, errors, abandonment points, confidence, and the System Usability Scale.</w:t>
       </w:r>
     </w:p>
-    <w:bookmarkEnd w:id="17"/>
-    <w:bookmarkStart w:id="18" w:name="accessibility-checks"/>
+    <w:bookmarkEnd w:id="32"/>
+    <w:bookmarkStart w:id="33" w:name="accessibility-checks"/>
     <w:p>
       <w:pPr>
         <w:pStyle w:val="Heading3"/>
@@ -1379,7 +2310,7 @@
         <w:rPr>
           <w:rStyle w:val="SectionNumber"/>
         </w:rPr>
-        <w:t xml:space="preserve">1.6.2</w:t>
+        <w:t xml:space="preserve">1.8.2</w:t>
       </w:r>
       <w:r>
         <w:tab/>
@@ -1393,7 +2324,7 @@
         <w:pStyle w:val="Compact"/>
         <w:numPr>
           <w:ilvl w:val="0"/>
-          <w:numId w:val="1008"/>
+          <w:numId w:val="1013"/>
         </w:numPr>
       </w:pPr>
       <w:r>
@@ -1405,7 +2336,7 @@
         <w:pStyle w:val="Compact"/>
         <w:numPr>
           <w:ilvl w:val="0"/>
-          <w:numId w:val="1008"/>
+          <w:numId w:val="1013"/>
         </w:numPr>
       </w:pPr>
       <w:r>
@@ -1417,7 +2348,7 @@
         <w:pStyle w:val="Compact"/>
         <w:numPr>
           <w:ilvl w:val="0"/>
-          <w:numId w:val="1008"/>
+          <w:numId w:val="1013"/>
         </w:numPr>
       </w:pPr>
       <w:r>
@@ -1429,7 +2360,7 @@
         <w:pStyle w:val="Compact"/>
         <w:numPr>
           <w:ilvl w:val="0"/>
-          <w:numId w:val="1008"/>
+          <w:numId w:val="1013"/>
         </w:numPr>
       </w:pPr>
       <w:r>
@@ -1441,15 +2372,15 @@
         <w:pStyle w:val="Compact"/>
         <w:numPr>
           <w:ilvl w:val="0"/>
-          <w:numId w:val="1008"/>
+          <w:numId w:val="1013"/>
         </w:numPr>
       </w:pPr>
       <w:r>
         <w:t xml:space="preserve">Text/table alternatives for charts.</w:t>
       </w:r>
     </w:p>
-    <w:bookmarkEnd w:id="18"/>
-    <w:bookmarkStart w:id="19" w:name="functional-regression-suite"/>
+    <w:bookmarkEnd w:id="33"/>
+    <w:bookmarkStart w:id="34" w:name="functional-regression-suite"/>
     <w:p>
       <w:pPr>
         <w:pStyle w:val="Heading3"/>
@@ -1458,7 +2389,7 @@
         <w:rPr>
           <w:rStyle w:val="SectionNumber"/>
         </w:rPr>
-        <w:t xml:space="preserve">1.6.3</w:t>
+        <w:t xml:space="preserve">1.8.3</w:t>
       </w:r>
       <w:r>
         <w:tab/>
@@ -1472,7 +2403,7 @@
         <w:pStyle w:val="Compact"/>
         <w:numPr>
           <w:ilvl w:val="0"/>
-          <w:numId w:val="1009"/>
+          <w:numId w:val="1014"/>
         </w:numPr>
       </w:pPr>
       <w:r>
@@ -1484,7 +2415,7 @@
         <w:pStyle w:val="Compact"/>
         <w:numPr>
           <w:ilvl w:val="0"/>
-          <w:numId w:val="1009"/>
+          <w:numId w:val="1014"/>
         </w:numPr>
       </w:pPr>
       <w:r>
@@ -1496,7 +2427,7 @@
         <w:pStyle w:val="Compact"/>
         <w:numPr>
           <w:ilvl w:val="0"/>
-          <w:numId w:val="1009"/>
+          <w:numId w:val="1014"/>
         </w:numPr>
       </w:pPr>
       <w:r>
@@ -1508,7 +2439,7 @@
         <w:pStyle w:val="Compact"/>
         <w:numPr>
           <w:ilvl w:val="0"/>
-          <w:numId w:val="1009"/>
+          <w:numId w:val="1014"/>
         </w:numPr>
       </w:pPr>
       <w:r>
@@ -1520,7 +2451,7 @@
         <w:pStyle w:val="Compact"/>
         <w:numPr>
           <w:ilvl w:val="0"/>
-          <w:numId w:val="1009"/>
+          <w:numId w:val="1014"/>
         </w:numPr>
       </w:pPr>
       <w:r>
@@ -1532,7 +2463,7 @@
         <w:pStyle w:val="Compact"/>
         <w:numPr>
           <w:ilvl w:val="0"/>
-          <w:numId w:val="1009"/>
+          <w:numId w:val="1014"/>
         </w:numPr>
       </w:pPr>
       <w:r>
@@ -1544,7 +2475,7 @@
         <w:pStyle w:val="Compact"/>
         <w:numPr>
           <w:ilvl w:val="0"/>
-          <w:numId w:val="1009"/>
+          <w:numId w:val="1014"/>
         </w:numPr>
       </w:pPr>
       <w:r>
@@ -1556,7 +2487,7 @@
         <w:pStyle w:val="Compact"/>
         <w:numPr>
           <w:ilvl w:val="0"/>
-          <w:numId w:val="1009"/>
+          <w:numId w:val="1014"/>
         </w:numPr>
       </w:pPr>
       <w:r>
@@ -1568,7 +2499,7 @@
         <w:pStyle w:val="Compact"/>
         <w:numPr>
           <w:ilvl w:val="0"/>
-          <w:numId w:val="1009"/>
+          <w:numId w:val="1014"/>
         </w:numPr>
       </w:pPr>
       <w:r>
@@ -1580,7 +2511,7 @@
         <w:pStyle w:val="Compact"/>
         <w:numPr>
           <w:ilvl w:val="0"/>
-          <w:numId w:val="1009"/>
+          <w:numId w:val="1014"/>
         </w:numPr>
       </w:pPr>
       <w:r>
@@ -1592,16 +2523,16 @@
         <w:pStyle w:val="Compact"/>
         <w:numPr>
           <w:ilvl w:val="0"/>
-          <w:numId w:val="1009"/>
+          <w:numId w:val="1014"/>
         </w:numPr>
       </w:pPr>
       <w:r>
         <w:t xml:space="preserve">Chrome, Safari, Firefox, and Edge on desktop and mobile breakpoints.</w:t>
       </w:r>
     </w:p>
-    <w:bookmarkEnd w:id="19"/>
-    <w:bookmarkEnd w:id="20"/>
-    <w:bookmarkStart w:id="25" w:name="proposed-delivery-sequence"/>
+    <w:bookmarkEnd w:id="34"/>
+    <w:bookmarkEnd w:id="35"/>
+    <w:bookmarkStart w:id="40" w:name="proposed-delivery-sequence"/>
     <w:p>
       <w:pPr>
         <w:pStyle w:val="Heading2"/>
@@ -1610,7 +2541,7 @@
         <w:rPr>
           <w:rStyle w:val="SectionNumber"/>
         </w:rPr>
-        <w:t xml:space="preserve">1.7</w:t>
+        <w:t xml:space="preserve">1.9</w:t>
       </w:r>
       <w:r>
         <w:tab/>
@@ -1619,7 +2550,7 @@
         <w:t xml:space="preserve">Proposed delivery sequence</w:t>
       </w:r>
     </w:p>
-    <w:bookmarkStart w:id="21" w:name="immediate-stabilization"/>
+    <w:bookmarkStart w:id="36" w:name="immediate-stabilization"/>
     <w:p>
       <w:pPr>
         <w:pStyle w:val="Heading3"/>
@@ -1628,7 +2559,7 @@
         <w:rPr>
           <w:rStyle w:val="SectionNumber"/>
         </w:rPr>
-        <w:t xml:space="preserve">1.7.1</w:t>
+        <w:t xml:space="preserve">1.9.1</w:t>
       </w:r>
       <w:r>
         <w:tab/>
@@ -1642,7 +2573,7 @@
         <w:pStyle w:val="Compact"/>
         <w:numPr>
           <w:ilvl w:val="0"/>
-          <w:numId w:val="1010"/>
+          <w:numId w:val="1015"/>
         </w:numPr>
       </w:pPr>
       <w:r>
@@ -1654,7 +2585,7 @@
         <w:pStyle w:val="Compact"/>
         <w:numPr>
           <w:ilvl w:val="0"/>
-          <w:numId w:val="1010"/>
+          <w:numId w:val="1015"/>
         </w:numPr>
       </w:pPr>
       <w:r>
@@ -1666,7 +2597,7 @@
         <w:pStyle w:val="Compact"/>
         <w:numPr>
           <w:ilvl w:val="0"/>
-          <w:numId w:val="1010"/>
+          <w:numId w:val="1015"/>
         </w:numPr>
       </w:pPr>
       <w:r>
@@ -1678,7 +2609,7 @@
         <w:pStyle w:val="Compact"/>
         <w:numPr>
           <w:ilvl w:val="0"/>
-          <w:numId w:val="1010"/>
+          <w:numId w:val="1015"/>
         </w:numPr>
       </w:pPr>
       <w:r>
@@ -1690,15 +2621,15 @@
         <w:pStyle w:val="Compact"/>
         <w:numPr>
           <w:ilvl w:val="0"/>
-          <w:numId w:val="1010"/>
+          <w:numId w:val="1015"/>
         </w:numPr>
       </w:pPr>
       <w:r>
         <w:t xml:space="preserve">Training review and analytics filtering fixes</w:t>
       </w:r>
     </w:p>
-    <w:bookmarkEnd w:id="21"/>
-    <w:bookmarkStart w:id="22" w:name="conversion-and-trust"/>
+    <w:bookmarkEnd w:id="36"/>
+    <w:bookmarkStart w:id="37" w:name="conversion-and-trust"/>
     <w:p>
       <w:pPr>
         <w:pStyle w:val="Heading3"/>
@@ -1707,7 +2638,7 @@
         <w:rPr>
           <w:rStyle w:val="SectionNumber"/>
         </w:rPr>
-        <w:t xml:space="preserve">1.7.2</w:t>
+        <w:t xml:space="preserve">1.9.2</w:t>
       </w:r>
       <w:r>
         <w:tab/>
@@ -1721,7 +2652,7 @@
         <w:pStyle w:val="Compact"/>
         <w:numPr>
           <w:ilvl w:val="0"/>
-          <w:numId w:val="1011"/>
+          <w:numId w:val="1016"/>
         </w:numPr>
       </w:pPr>
       <w:r>
@@ -1733,7 +2664,7 @@
         <w:pStyle w:val="Compact"/>
         <w:numPr>
           <w:ilvl w:val="0"/>
-          <w:numId w:val="1011"/>
+          <w:numId w:val="1016"/>
         </w:numPr>
       </w:pPr>
       <w:r>
@@ -1745,7 +2676,7 @@
         <w:pStyle w:val="Compact"/>
         <w:numPr>
           <w:ilvl w:val="0"/>
-          <w:numId w:val="1011"/>
+          <w:numId w:val="1016"/>
         </w:numPr>
       </w:pPr>
       <w:r>
@@ -1757,15 +2688,15 @@
         <w:pStyle w:val="Compact"/>
         <w:numPr>
           <w:ilvl w:val="0"/>
-          <w:numId w:val="1011"/>
+          <w:numId w:val="1016"/>
         </w:numPr>
       </w:pPr>
       <w:r>
         <w:t xml:space="preserve">Receipt reconciliation and clearer support route</w:t>
       </w:r>
     </w:p>
-    <w:bookmarkEnd w:id="22"/>
-    <w:bookmarkStart w:id="23" w:name="guided-learning"/>
+    <w:bookmarkEnd w:id="37"/>
+    <w:bookmarkStart w:id="38" w:name="guided-learning"/>
     <w:p>
       <w:pPr>
         <w:pStyle w:val="Heading3"/>
@@ -1774,7 +2705,7 @@
         <w:rPr>
           <w:rStyle w:val="SectionNumber"/>
         </w:rPr>
-        <w:t xml:space="preserve">1.7.3</w:t>
+        <w:t xml:space="preserve">1.9.3</w:t>
       </w:r>
       <w:r>
         <w:tab/>
@@ -1788,7 +2719,7 @@
         <w:pStyle w:val="Compact"/>
         <w:numPr>
           <w:ilvl w:val="0"/>
-          <w:numId w:val="1012"/>
+          <w:numId w:val="1017"/>
         </w:numPr>
       </w:pPr>
       <w:r>
@@ -1800,7 +2731,7 @@
         <w:pStyle w:val="Compact"/>
         <w:numPr>
           <w:ilvl w:val="0"/>
-          <w:numId w:val="1012"/>
+          <w:numId w:val="1017"/>
         </w:numPr>
       </w:pPr>
       <w:r>
@@ -1812,7 +2743,7 @@
         <w:pStyle w:val="Compact"/>
         <w:numPr>
           <w:ilvl w:val="0"/>
-          <w:numId w:val="1012"/>
+          <w:numId w:val="1017"/>
         </w:numPr>
       </w:pPr>
       <w:r>
@@ -1824,15 +2755,15 @@
         <w:pStyle w:val="Compact"/>
         <w:numPr>
           <w:ilvl w:val="0"/>
-          <w:numId w:val="1012"/>
+          <w:numId w:val="1017"/>
         </w:numPr>
       </w:pPr>
       <w:r>
         <w:t xml:space="preserve">Mobile simulator compression and onboarding</w:t>
       </w:r>
     </w:p>
-    <w:bookmarkEnd w:id="23"/>
-    <w:bookmarkStart w:id="24" w:name="ongoing-assurance"/>
+    <w:bookmarkEnd w:id="38"/>
+    <w:bookmarkStart w:id="39" w:name="ongoing-assurance"/>
     <w:p>
       <w:pPr>
         <w:pStyle w:val="Heading3"/>
@@ -1841,7 +2772,7 @@
         <w:rPr>
           <w:rStyle w:val="SectionNumber"/>
         </w:rPr>
-        <w:t xml:space="preserve">1.7.4</w:t>
+        <w:t xml:space="preserve">1.9.4</w:t>
       </w:r>
       <w:r>
         <w:tab/>
@@ -1855,7 +2786,7 @@
         <w:pStyle w:val="Compact"/>
         <w:numPr>
           <w:ilvl w:val="0"/>
-          <w:numId w:val="1013"/>
+          <w:numId w:val="1018"/>
         </w:numPr>
       </w:pPr>
       <w:r>
@@ -1867,7 +2798,7 @@
         <w:pStyle w:val="Compact"/>
         <w:numPr>
           <w:ilvl w:val="0"/>
-          <w:numId w:val="1013"/>
+          <w:numId w:val="1018"/>
         </w:numPr>
       </w:pPr>
       <w:r>
@@ -1879,7 +2810,7 @@
         <w:pStyle w:val="Compact"/>
         <w:numPr>
           <w:ilvl w:val="0"/>
-          <w:numId w:val="1013"/>
+          <w:numId w:val="1018"/>
         </w:numPr>
       </w:pPr>
       <w:r>
@@ -1891,16 +2822,16 @@
         <w:pStyle w:val="Compact"/>
         <w:numPr>
           <w:ilvl w:val="0"/>
-          <w:numId w:val="1013"/>
+          <w:numId w:val="1018"/>
         </w:numPr>
       </w:pPr>
       <w:r>
         <w:t xml:space="preserve">Payment and data-security review before enabling live transactions</w:t>
       </w:r>
     </w:p>
-    <w:bookmarkEnd w:id="24"/>
-    <w:bookmarkEnd w:id="25"/>
-    <w:bookmarkStart w:id="26" w:name="launch-readiness-statement"/>
+    <w:bookmarkEnd w:id="39"/>
+    <w:bookmarkEnd w:id="40"/>
+    <w:bookmarkStart w:id="41" w:name="launch-readiness-statement"/>
     <w:p>
       <w:pPr>
         <w:pStyle w:val="Heading2"/>
@@ -1909,7 +2840,7 @@
         <w:rPr>
           <w:rStyle w:val="SectionNumber"/>
         </w:rPr>
-        <w:t xml:space="preserve">1.8</w:t>
+        <w:t xml:space="preserve">1.10</w:t>
       </w:r>
       <w:r>
         <w:tab/>
@@ -1926,8 +2857,8 @@
         <w:t xml:space="preserve">PM Exam Pro’s core experience is working and demonstrates strong potential. After the immediate stabilization items are resolved and retested, the platform should be in a much stronger position for public acquisition: credible catalog promises, trustworthy payment, uninterrupted exam access, and analytics that clearly guide each learner’s next step.</w:t>
       </w:r>
     </w:p>
-    <w:bookmarkEnd w:id="26"/>
-    <w:bookmarkEnd w:id="27"/>
+    <w:bookmarkEnd w:id="41"/>
+    <w:bookmarkEnd w:id="42"/>
     <w:sectPr>
       <w:footnotePr>
         <w:numRestart w:val="eachSect"/>
@@ -2302,6 +3233,18 @@
     <w:abstractNumId w:val="991"/>
   </w:num>
   <w:num w:numId="1007">
+    <w:abstractNumId w:val="991"/>
+  </w:num>
+  <w:num w:numId="1008">
+    <w:abstractNumId w:val="991"/>
+  </w:num>
+  <w:num w:numId="1009">
+    <w:abstractNumId w:val="991"/>
+  </w:num>
+  <w:num w:numId="1010">
+    <w:abstractNumId w:val="991"/>
+  </w:num>
+  <w:num w:numId="1011">
     <w:abstractNumId w:val="99411"/>
     <w:lvlOverride w:ilvl="0">
       <w:startOverride w:val="1"/>
@@ -2331,22 +3274,52 @@
       <w:startOverride w:val="1"/>
     </w:lvlOverride>
   </w:num>
-  <w:num w:numId="1008">
+  <w:num w:numId="1012">
+    <w:abstractNumId w:val="99411"/>
+    <w:lvlOverride w:ilvl="0">
+      <w:startOverride w:val="1"/>
+    </w:lvlOverride>
+    <w:lvlOverride w:ilvl="1">
+      <w:startOverride w:val="1"/>
+    </w:lvlOverride>
+    <w:lvlOverride w:ilvl="2">
+      <w:startOverride w:val="1"/>
+    </w:lvlOverride>
+    <w:lvlOverride w:ilvl="3">
+      <w:startOverride w:val="1"/>
+    </w:lvlOverride>
+    <w:lvlOverride w:ilvl="4">
+      <w:startOverride w:val="1"/>
+    </w:lvlOverride>
+    <w:lvlOverride w:ilvl="5">
+      <w:startOverride w:val="1"/>
+    </w:lvlOverride>
+    <w:lvlOverride w:ilvl="6">
+      <w:startOverride w:val="1"/>
+    </w:lvlOverride>
+    <w:lvlOverride w:ilvl="7">
+      <w:startOverride w:val="1"/>
+    </w:lvlOverride>
+    <w:lvlOverride w:ilvl="8">
+      <w:startOverride w:val="1"/>
+    </w:lvlOverride>
+  </w:num>
+  <w:num w:numId="1013">
     <w:abstractNumId w:val="991"/>
   </w:num>
-  <w:num w:numId="1009">
+  <w:num w:numId="1014">
     <w:abstractNumId w:val="991"/>
   </w:num>
-  <w:num w:numId="1010">
+  <w:num w:numId="1015">
     <w:abstractNumId w:val="991"/>
   </w:num>
-  <w:num w:numId="1011">
+  <w:num w:numId="1016">
     <w:abstractNumId w:val="991"/>
   </w:num>
-  <w:num w:numId="1012">
+  <w:num w:numId="1017">
     <w:abstractNumId w:val="991"/>
   </w:num>
-  <w:num w:numId="1013">
+  <w:num w:numId="1018">
     <w:abstractNumId w:val="991"/>
   </w:num>
 </w:numbering>

</xml_diff>

<commit_message>
Clarify ECO and performance domain strategy
</commit_message>
<xml_diff>
--- a/docs/CLIENT-JOURNEY-UX-REVIEW-2026-09-07.docx
+++ b/docs/CLIENT-JOURNEY-UX-REVIEW-2026-09-07.docx
@@ -28,7 +28,7 @@
         </w:p>
       </w:sdtContent>
     </w:sdt>
-    <w:bookmarkStart w:id="42" w:name="X31edbf0c8689b3ad19cb239b9aa0d2ec181b7cf"/>
+    <w:bookmarkStart w:id="44" w:name="X31edbf0c8689b3ad19cb239b9aa0d2ec181b7cf"/>
     <w:p>
       <w:pPr>
         <w:pStyle w:val="Heading1"/>
@@ -1330,7 +1330,7 @@
       </w:r>
     </w:p>
     <w:bookmarkEnd w:id="19"/>
-    <w:bookmarkStart w:id="31" w:name="X10ec9f42471790dd4027a359be621fedbef4b9e"/>
+    <w:bookmarkStart w:id="33" w:name="X10ec9f42471790dd4027a359be621fedbef4b9e"/>
     <w:p>
       <w:pPr>
         <w:pStyle w:val="Heading2"/>
@@ -1555,7 +1555,7 @@
       </w:r>
     </w:p>
     <w:bookmarkEnd w:id="25"/>
-    <w:bookmarkStart w:id="27" w:name="add-time-management-and-stamina-metrics"/>
+    <w:bookmarkStart w:id="27" w:name="X52efa8924252669dd906ec7d14811855285ac0c"/>
     <w:p>
       <w:pPr>
         <w:pStyle w:val="Heading3"/>
@@ -1570,6 +1570,507 @@
         <w:tab/>
       </w:r>
       <w:r>
+        <w:t xml:space="preserve">Why ECO domains and performance classifications matter</w:t>
+      </w:r>
+    </w:p>
+    <w:p>
+      <w:pPr>
+        <w:pStyle w:val="FirstParagraph"/>
+      </w:pPr>
+      <w:r>
+        <w:t xml:space="preserve">These fields are essential, not optional reporting labels. They allow PM Exam Pro to:</w:t>
+      </w:r>
+    </w:p>
+    <w:p>
+      <w:pPr>
+        <w:pStyle w:val="Compact"/>
+        <w:numPr>
+          <w:ilvl w:val="0"/>
+          <w:numId w:val="1008"/>
+        </w:numPr>
+      </w:pPr>
+      <w:r>
+        <w:t xml:space="preserve">Build simulations in proportions that resemble the real exam blueprint.</w:t>
+      </w:r>
+    </w:p>
+    <w:p>
+      <w:pPr>
+        <w:pStyle w:val="Compact"/>
+        <w:numPr>
+          <w:ilvl w:val="0"/>
+          <w:numId w:val="1008"/>
+        </w:numPr>
+      </w:pPr>
+      <w:r>
+        <w:t xml:space="preserve">Tell learners exactly which capability is reducing their score.</w:t>
+      </w:r>
+    </w:p>
+    <w:p>
+      <w:pPr>
+        <w:pStyle w:val="Compact"/>
+        <w:numPr>
+          <w:ilvl w:val="0"/>
+          <w:numId w:val="1008"/>
+        </w:numPr>
+      </w:pPr>
+      <w:r>
+        <w:t xml:space="preserve">Recommend the most valuable next practice activity.</w:t>
+      </w:r>
+    </w:p>
+    <w:p>
+      <w:pPr>
+        <w:pStyle w:val="Compact"/>
+        <w:numPr>
+          <w:ilvl w:val="0"/>
+          <w:numId w:val="1008"/>
+        </w:numPr>
+      </w:pPr>
+      <w:r>
+        <w:t xml:space="preserve">Distinguish a knowledge weakness from difficulty with a particular way of working.</w:t>
+      </w:r>
+    </w:p>
+    <w:p>
+      <w:pPr>
+        <w:pStyle w:val="Compact"/>
+        <w:numPr>
+          <w:ilvl w:val="0"/>
+          <w:numId w:val="1008"/>
+        </w:numPr>
+      </w:pPr>
+      <w:r>
+        <w:t xml:space="preserve">Measure whether the question bank covers the complete syllabus.</w:t>
+      </w:r>
+    </w:p>
+    <w:p>
+      <w:pPr>
+        <w:pStyle w:val="Compact"/>
+        <w:numPr>
+          <w:ilvl w:val="0"/>
+          <w:numId w:val="1008"/>
+        </w:numPr>
+      </w:pPr>
+      <w:r>
+        <w:t xml:space="preserve">Update and retire content safely when PMI changes an exam blueprint.</w:t>
+      </w:r>
+    </w:p>
+    <w:p>
+      <w:pPr>
+        <w:pStyle w:val="FirstParagraph"/>
+      </w:pPr>
+      <w:r>
+        <w:t xml:space="preserve">The platform should use clear, separate classifications:</w:t>
+      </w:r>
+    </w:p>
+    <w:tbl>
+      <w:tblPr>
+        <w:tblStyle w:val="Table"/>
+        <w:tblW w:type="pct" w:w="5000"/>
+        <w:tblLayout w:type="fixed"/>
+        <w:tblLook w:firstRow="1" w:lastRow="0" w:firstColumn="0" w:lastColumn="0" w:noHBand="0" w:noVBand="0" w:val="0020"/>
+      </w:tblPr>
+      <w:tblGrid>
+        <w:gridCol w:w="2640"/>
+        <w:gridCol w:w="2640"/>
+        <w:gridCol w:w="2640"/>
+      </w:tblGrid>
+      <w:tr>
+        <w:trPr>
+          <w:tblHeader w:val="on"/>
+        </w:trPr>
+        <w:tc>
+          <w:tcPr/>
+          <w:p>
+            <w:pPr>
+              <w:pStyle w:val="Compact"/>
+            </w:pPr>
+            <w:r>
+              <w:t xml:space="preserve">Classification</w:t>
+            </w:r>
+          </w:p>
+        </w:tc>
+        <w:tc>
+          <w:tcPr/>
+          <w:p>
+            <w:pPr>
+              <w:pStyle w:val="Compact"/>
+            </w:pPr>
+            <w:r>
+              <w:t xml:space="preserve">What it answers</w:t>
+            </w:r>
+          </w:p>
+        </w:tc>
+        <w:tc>
+          <w:tcPr/>
+          <w:p>
+            <w:pPr>
+              <w:pStyle w:val="Compact"/>
+            </w:pPr>
+            <w:r>
+              <w:t xml:space="preserve">Example</w:t>
+            </w:r>
+          </w:p>
+        </w:tc>
+      </w:tr>
+      <w:tr>
+        <w:tc>
+          <w:tcPr/>
+          <w:p>
+            <w:pPr>
+              <w:pStyle w:val="Compact"/>
+            </w:pPr>
+            <w:r>
+              <w:t xml:space="preserve">ECO domain</w:t>
+            </w:r>
+          </w:p>
+        </w:tc>
+        <w:tc>
+          <w:tcPr/>
+          <w:p>
+            <w:pPr>
+              <w:pStyle w:val="Compact"/>
+            </w:pPr>
+            <w:r>
+              <w:t xml:space="preserve">Which official exam area is being tested?</w:t>
+            </w:r>
+          </w:p>
+        </w:tc>
+        <w:tc>
+          <w:tcPr/>
+          <w:p>
+            <w:pPr>
+              <w:pStyle w:val="Compact"/>
+            </w:pPr>
+            <w:r>
+              <w:t xml:space="preserve">PMP People, Process, or Business Environment</w:t>
+            </w:r>
+          </w:p>
+        </w:tc>
+      </w:tr>
+      <w:tr>
+        <w:tc>
+          <w:tcPr/>
+          <w:p>
+            <w:pPr>
+              <w:pStyle w:val="Compact"/>
+            </w:pPr>
+            <w:r>
+              <w:t xml:space="preserve">ECO task/objective</w:t>
+            </w:r>
+          </w:p>
+        </w:tc>
+        <w:tc>
+          <w:tcPr/>
+          <w:p>
+            <w:pPr>
+              <w:pStyle w:val="Compact"/>
+            </w:pPr>
+            <w:r>
+              <w:t xml:space="preserve">Which specific capability needs improvement?</w:t>
+            </w:r>
+          </w:p>
+        </w:tc>
+        <w:tc>
+          <w:tcPr/>
+          <w:p>
+            <w:pPr>
+              <w:pStyle w:val="Compact"/>
+            </w:pPr>
+            <w:r>
+              <w:t xml:space="preserve">A task or learning objective within the official outline</w:t>
+            </w:r>
+          </w:p>
+        </w:tc>
+      </w:tr>
+      <w:tr>
+        <w:tc>
+          <w:tcPr/>
+          <w:p>
+            <w:pPr>
+              <w:pStyle w:val="Compact"/>
+            </w:pPr>
+            <w:r>
+              <w:t xml:space="preserve">Delivery approach</w:t>
+            </w:r>
+          </w:p>
+        </w:tc>
+        <w:tc>
+          <w:tcPr/>
+          <w:p>
+            <w:pPr>
+              <w:pStyle w:val="Compact"/>
+            </w:pPr>
+            <w:r>
+              <w:t xml:space="preserve">In which project context is the skill applied?</w:t>
+            </w:r>
+          </w:p>
+        </w:tc>
+        <w:tc>
+          <w:tcPr/>
+          <w:p>
+            <w:pPr>
+              <w:pStyle w:val="Compact"/>
+            </w:pPr>
+            <w:r>
+              <w:t xml:space="preserve">Predictive, adaptive/agile, hybrid, or agnostic</w:t>
+            </w:r>
+          </w:p>
+        </w:tc>
+      </w:tr>
+      <w:tr>
+        <w:tc>
+          <w:tcPr/>
+          <w:p>
+            <w:pPr>
+              <w:pStyle w:val="Compact"/>
+            </w:pPr>
+            <w:r>
+              <w:t xml:space="preserve">PMBOK performance domain</w:t>
+            </w:r>
+          </w:p>
+        </w:tc>
+        <w:tc>
+          <w:tcPr/>
+          <w:p>
+            <w:pPr>
+              <w:pStyle w:val="Compact"/>
+            </w:pPr>
+            <w:r>
+              <w:t xml:space="preserve">Which broader practice area supports learning?</w:t>
+            </w:r>
+          </w:p>
+        </w:tc>
+        <w:tc>
+          <w:tcPr/>
+          <w:p>
+            <w:pPr>
+              <w:pStyle w:val="Compact"/>
+            </w:pPr>
+            <w:r>
+              <w:t xml:space="preserve">Current PMBOK areas such as governance, scope, schedule, finance, stakeholders, resources, or risk</w:t>
+            </w:r>
+          </w:p>
+        </w:tc>
+      </w:tr>
+    </w:tbl>
+    <w:p>
+      <w:pPr>
+        <w:pStyle w:val="BodyText"/>
+      </w:pPr>
+      <w:r>
+        <w:t xml:space="preserve">The existing labels “Agile,” “Hybrid,” “Predictive,” and “Agnostic” describe</w:t>
+      </w:r>
+      <w:r>
+        <w:t xml:space="preserve"> </w:t>
+      </w:r>
+      <w:r>
+        <w:rPr>
+          <w:b/>
+          <w:bCs/>
+        </w:rPr>
+        <w:t xml:space="preserve">delivery approaches</w:t>
+      </w:r>
+      <w:r>
+        <w:t xml:space="preserve">. They should not be called Project Performance Domains. PMI’s PMP outline says these approaches occur across the ECO domains rather than functioning as separate exam domains. The</w:t>
+      </w:r>
+      <w:r>
+        <w:t xml:space="preserve"> </w:t>
+      </w:r>
+      <w:hyperlink r:id="rId23">
+        <w:r>
+          <w:rPr>
+            <w:rStyle w:val="Hyperlink"/>
+          </w:rPr>
+          <w:t xml:space="preserve">2026 PMP Examination Content Outline</w:t>
+        </w:r>
+      </w:hyperlink>
+      <w:r>
+        <w:t xml:space="preserve"> </w:t>
+      </w:r>
+      <w:r>
+        <w:t xml:space="preserve">and</w:t>
+      </w:r>
+      <w:r>
+        <w:t xml:space="preserve"> </w:t>
+      </w:r>
+      <w:hyperlink r:id="rId26">
+        <w:r>
+          <w:rPr>
+            <w:rStyle w:val="Hyperlink"/>
+          </w:rPr>
+          <w:t xml:space="preserve">PMBOK Guide overview</w:t>
+        </w:r>
+      </w:hyperlink>
+      <w:r>
+        <w:t xml:space="preserve"> </w:t>
+      </w:r>
+      <w:r>
+        <w:t xml:space="preserve">describe these separate structures.</w:t>
+      </w:r>
+    </w:p>
+    <w:p>
+      <w:pPr>
+        <w:pStyle w:val="BodyText"/>
+      </w:pPr>
+      <w:r>
+        <w:t xml:space="preserve">This distinction matters to the user. Consider two learners who both score 68%:</w:t>
+      </w:r>
+    </w:p>
+    <w:p>
+      <w:pPr>
+        <w:pStyle w:val="Compact"/>
+        <w:numPr>
+          <w:ilvl w:val="0"/>
+          <w:numId w:val="1009"/>
+        </w:numPr>
+      </w:pPr>
+      <w:r>
+        <w:t xml:space="preserve">Learner A is balanced across all official domains but slow near the end.</w:t>
+      </w:r>
+    </w:p>
+    <w:p>
+      <w:pPr>
+        <w:pStyle w:val="Compact"/>
+        <w:numPr>
+          <w:ilvl w:val="0"/>
+          <w:numId w:val="1009"/>
+        </w:numPr>
+      </w:pPr>
+      <w:r>
+        <w:t xml:space="preserve">Learner B is strong in People and weak in Business Environment, especially in adaptive/hybrid scenarios.</w:t>
+      </w:r>
+    </w:p>
+    <w:p>
+      <w:pPr>
+        <w:pStyle w:val="FirstParagraph"/>
+      </w:pPr>
+      <w:r>
+        <w:t xml:space="preserve">Their overall score is identical, but the correct recommendation is completely different. Learner A needs pacing and stamina practice. Learner B needs targeted content practice. Accurate ECO, task, and delivery-approach tagging makes that recommendation possible.</w:t>
+      </w:r>
+    </w:p>
+    <w:p>
+      <w:pPr>
+        <w:pStyle w:val="BodyText"/>
+      </w:pPr>
+      <w:r>
+        <w:t xml:space="preserve">For every question, PM Exam Pro should store a blueprint version, one primary ECO domain, one primary task/objective, one delivery approach, controlled topic tags, difficulty, and review/version information. PMBOK performance domain can be an optional secondary learning classification. Use controlled lists rather than free text, and avoid combining several tasks into one new label.</w:t>
+      </w:r>
+    </w:p>
+    <w:p>
+      <w:pPr>
+        <w:pStyle w:val="BodyText"/>
+      </w:pPr>
+      <w:r>
+        <w:t xml:space="preserve">The learner dashboard should then show:</w:t>
+      </w:r>
+    </w:p>
+    <w:p>
+      <w:pPr>
+        <w:pStyle w:val="Compact"/>
+        <w:numPr>
+          <w:ilvl w:val="0"/>
+          <w:numId w:val="1010"/>
+        </w:numPr>
+      </w:pPr>
+      <w:r>
+        <w:t xml:space="preserve">Official domain name and blueprint weight</w:t>
+      </w:r>
+    </w:p>
+    <w:p>
+      <w:pPr>
+        <w:pStyle w:val="Compact"/>
+        <w:numPr>
+          <w:ilvl w:val="0"/>
+          <w:numId w:val="1010"/>
+        </w:numPr>
+      </w:pPr>
+      <w:r>
+        <w:t xml:space="preserve">First-seen accuracy and number of questions attempted</w:t>
+      </w:r>
+    </w:p>
+    <w:p>
+      <w:pPr>
+        <w:pStyle w:val="Compact"/>
+        <w:numPr>
+          <w:ilvl w:val="0"/>
+          <w:numId w:val="1010"/>
+        </w:numPr>
+      </w:pPr>
+      <w:r>
+        <w:t xml:space="preserve">Coverage compared with the expected exam proportion</w:t>
+      </w:r>
+    </w:p>
+    <w:p>
+      <w:pPr>
+        <w:pStyle w:val="Compact"/>
+        <w:numPr>
+          <w:ilvl w:val="0"/>
+          <w:numId w:val="1010"/>
+        </w:numPr>
+      </w:pPr>
+      <w:r>
+        <w:t xml:space="preserve">Recent direction of improvement</w:t>
+      </w:r>
+    </w:p>
+    <w:p>
+      <w:pPr>
+        <w:pStyle w:val="Compact"/>
+        <w:numPr>
+          <w:ilvl w:val="0"/>
+          <w:numId w:val="1010"/>
+        </w:numPr>
+      </w:pPr>
+      <w:r>
+        <w:t xml:space="preserve">Confidence in the result or “Not enough evidence”</w:t>
+      </w:r>
+    </w:p>
+    <w:p>
+      <w:pPr>
+        <w:pStyle w:val="Compact"/>
+        <w:numPr>
+          <w:ilvl w:val="0"/>
+          <w:numId w:val="1010"/>
+        </w:numPr>
+      </w:pPr>
+      <w:r>
+        <w:t xml:space="preserve">Performance by delivery approach within each domain</w:t>
+      </w:r>
+    </w:p>
+    <w:p>
+      <w:pPr>
+        <w:pStyle w:val="Compact"/>
+        <w:numPr>
+          <w:ilvl w:val="0"/>
+          <w:numId w:val="1010"/>
+        </w:numPr>
+      </w:pPr>
+      <w:r>
+        <w:t xml:space="preserve">A direct action such as “Practise 15 fresh Business Environment questions”</w:t>
+      </w:r>
+    </w:p>
+    <w:p>
+      <w:pPr>
+        <w:pStyle w:val="FirstParagraph"/>
+      </w:pPr>
+      <w:r>
+        <w:t xml:space="preserve">Until these tags are standardized, domain percentages may look precise but can give unreliable advice. The domain component of a readiness score should remain disabled or clearly provisional until content classification is clean.</w:t>
+      </w:r>
+    </w:p>
+    <w:bookmarkEnd w:id="27"/>
+    <w:bookmarkStart w:id="29" w:name="add-time-management-and-stamina-metrics"/>
+    <w:p>
+      <w:pPr>
+        <w:pStyle w:val="Heading3"/>
+      </w:pPr>
+      <w:r>
+        <w:rPr>
+          <w:rStyle w:val="SectionNumber"/>
+        </w:rPr>
+        <w:t xml:space="preserve">1.7.6</w:t>
+      </w:r>
+      <w:r>
+        <w:tab/>
+      </w:r>
+      <w:r>
         <w:t xml:space="preserve">5. Add time-management and stamina metrics</w:t>
       </w:r>
     </w:p>
@@ -1586,7 +2087,7 @@
         <w:pStyle w:val="Compact"/>
         <w:numPr>
           <w:ilvl w:val="0"/>
-          <w:numId w:val="1008"/>
+          <w:numId w:val="1011"/>
         </w:numPr>
       </w:pPr>
       <w:r>
@@ -1598,7 +2099,7 @@
         <w:pStyle w:val="Compact"/>
         <w:numPr>
           <w:ilvl w:val="0"/>
-          <w:numId w:val="1008"/>
+          <w:numId w:val="1011"/>
         </w:numPr>
       </w:pPr>
       <w:r>
@@ -1610,7 +2111,7 @@
         <w:pStyle w:val="Compact"/>
         <w:numPr>
           <w:ilvl w:val="0"/>
-          <w:numId w:val="1008"/>
+          <w:numId w:val="1011"/>
         </w:numPr>
       </w:pPr>
       <w:r>
@@ -1622,7 +2123,7 @@
         <w:pStyle w:val="Compact"/>
         <w:numPr>
           <w:ilvl w:val="0"/>
-          <w:numId w:val="1008"/>
+          <w:numId w:val="1011"/>
         </w:numPr>
       </w:pPr>
       <w:r>
@@ -1634,7 +2135,7 @@
         <w:pStyle w:val="Compact"/>
         <w:numPr>
           <w:ilvl w:val="0"/>
-          <w:numId w:val="1008"/>
+          <w:numId w:val="1011"/>
         </w:numPr>
       </w:pPr>
       <w:r>
@@ -1651,7 +2152,7 @@
       <w:r>
         <w:t xml:space="preserve"> </w:t>
       </w:r>
-      <w:hyperlink r:id="rId26">
+      <w:hyperlink r:id="rId28">
         <w:r>
           <w:rPr>
             <w:rStyle w:val="Hyperlink"/>
@@ -1680,8 +2181,8 @@
         <w:t xml:space="preserve">.</w:t>
       </w:r>
     </w:p>
-    <w:bookmarkEnd w:id="27"/>
-    <w:bookmarkStart w:id="28" w:name="track-consistency-coverage-and-retention"/>
+    <w:bookmarkEnd w:id="29"/>
+    <w:bookmarkStart w:id="30" w:name="track-consistency-coverage-and-retention"/>
     <w:p>
       <w:pPr>
         <w:pStyle w:val="Heading3"/>
@@ -1690,7 +2191,7 @@
         <w:rPr>
           <w:rStyle w:val="SectionNumber"/>
         </w:rPr>
-        <w:t xml:space="preserve">1.7.6</w:t>
+        <w:t xml:space="preserve">1.7.7</w:t>
       </w:r>
       <w:r>
         <w:tab/>
@@ -1704,7 +2205,7 @@
         <w:pStyle w:val="Compact"/>
         <w:numPr>
           <w:ilvl w:val="0"/>
-          <w:numId w:val="1009"/>
+          <w:numId w:val="1012"/>
         </w:numPr>
       </w:pPr>
       <w:r>
@@ -1726,7 +2227,7 @@
         <w:pStyle w:val="Compact"/>
         <w:numPr>
           <w:ilvl w:val="0"/>
-          <w:numId w:val="1009"/>
+          <w:numId w:val="1012"/>
         </w:numPr>
       </w:pPr>
       <w:r>
@@ -1748,7 +2249,7 @@
         <w:pStyle w:val="Compact"/>
         <w:numPr>
           <w:ilvl w:val="0"/>
-          <w:numId w:val="1009"/>
+          <w:numId w:val="1012"/>
         </w:numPr>
       </w:pPr>
       <w:r>
@@ -1770,7 +2271,7 @@
         <w:pStyle w:val="Compact"/>
         <w:numPr>
           <w:ilvl w:val="0"/>
-          <w:numId w:val="1009"/>
+          <w:numId w:val="1012"/>
         </w:numPr>
       </w:pPr>
       <w:r>
@@ -1792,7 +2293,7 @@
         <w:pStyle w:val="Compact"/>
         <w:numPr>
           <w:ilvl w:val="0"/>
-          <w:numId w:val="1009"/>
+          <w:numId w:val="1012"/>
         </w:numPr>
       </w:pPr>
       <w:r>
@@ -1814,7 +2315,7 @@
         <w:pStyle w:val="Compact"/>
         <w:numPr>
           <w:ilvl w:val="0"/>
-          <w:numId w:val="1009"/>
+          <w:numId w:val="1012"/>
         </w:numPr>
       </w:pPr>
       <w:r>
@@ -1831,8 +2332,8 @@
         <w:t xml:space="preserve">optionally identify confident-but-wrong answers, which are the most dangerous misconceptions.</w:t>
       </w:r>
     </w:p>
-    <w:bookmarkEnd w:id="28"/>
-    <w:bookmarkStart w:id="29" w:name="X31b1e23002e8fedb5d6c179f7e52b391fa2a731"/>
+    <w:bookmarkEnd w:id="30"/>
+    <w:bookmarkStart w:id="31" w:name="X31b1e23002e8fedb5d6c179f7e52b391fa2a731"/>
     <w:p>
       <w:pPr>
         <w:pStyle w:val="Heading3"/>
@@ -1841,7 +2342,7 @@
         <w:rPr>
           <w:rStyle w:val="SectionNumber"/>
         </w:rPr>
-        <w:t xml:space="preserve">1.7.7</w:t>
+        <w:t xml:space="preserve">1.7.8</w:t>
       </w:r>
       <w:r>
         <w:tab/>
@@ -1882,7 +2383,7 @@
         <w:pStyle w:val="Compact"/>
         <w:numPr>
           <w:ilvl w:val="0"/>
-          <w:numId w:val="1010"/>
+          <w:numId w:val="1013"/>
         </w:numPr>
       </w:pPr>
       <w:r>
@@ -1894,7 +2395,7 @@
         <w:pStyle w:val="Compact"/>
         <w:numPr>
           <w:ilvl w:val="0"/>
-          <w:numId w:val="1010"/>
+          <w:numId w:val="1013"/>
         </w:numPr>
       </w:pPr>
       <w:r>
@@ -1906,7 +2407,7 @@
         <w:pStyle w:val="Compact"/>
         <w:numPr>
           <w:ilvl w:val="0"/>
-          <w:numId w:val="1010"/>
+          <w:numId w:val="1013"/>
         </w:numPr>
       </w:pPr>
       <w:r>
@@ -1918,7 +2419,7 @@
         <w:pStyle w:val="Compact"/>
         <w:numPr>
           <w:ilvl w:val="0"/>
-          <w:numId w:val="1010"/>
+          <w:numId w:val="1013"/>
         </w:numPr>
       </w:pPr>
       <w:r>
@@ -1930,7 +2431,7 @@
         <w:pStyle w:val="Compact"/>
         <w:numPr>
           <w:ilvl w:val="0"/>
-          <w:numId w:val="1010"/>
+          <w:numId w:val="1013"/>
         </w:numPr>
       </w:pPr>
       <w:r>
@@ -1942,15 +2443,15 @@
         <w:pStyle w:val="Compact"/>
         <w:numPr>
           <w:ilvl w:val="0"/>
-          <w:numId w:val="1010"/>
+          <w:numId w:val="1013"/>
         </w:numPr>
       </w:pPr>
       <w:r>
         <w:t xml:space="preserve">Be recalibrated later using consenting learners’ actual exam outcomes.</w:t>
       </w:r>
     </w:p>
-    <w:bookmarkEnd w:id="29"/>
-    <w:bookmarkStart w:id="30" w:name="recommended-dashboard-layout"/>
+    <w:bookmarkEnd w:id="31"/>
+    <w:bookmarkStart w:id="32" w:name="recommended-dashboard-layout"/>
     <w:p>
       <w:pPr>
         <w:pStyle w:val="Heading3"/>
@@ -1959,7 +2460,7 @@
         <w:rPr>
           <w:rStyle w:val="SectionNumber"/>
         </w:rPr>
-        <w:t xml:space="preserve">1.7.8</w:t>
+        <w:t xml:space="preserve">1.7.9</w:t>
       </w:r>
       <w:r>
         <w:tab/>
@@ -1973,7 +2474,7 @@
         <w:pStyle w:val="Compact"/>
         <w:numPr>
           <w:ilvl w:val="0"/>
-          <w:numId w:val="1011"/>
+          <w:numId w:val="1014"/>
         </w:numPr>
       </w:pPr>
       <w:r>
@@ -1995,7 +2496,7 @@
         <w:pStyle w:val="Compact"/>
         <w:numPr>
           <w:ilvl w:val="0"/>
-          <w:numId w:val="1011"/>
+          <w:numId w:val="1014"/>
         </w:numPr>
       </w:pPr>
       <w:r>
@@ -2017,7 +2518,7 @@
         <w:pStyle w:val="Compact"/>
         <w:numPr>
           <w:ilvl w:val="0"/>
-          <w:numId w:val="1011"/>
+          <w:numId w:val="1014"/>
         </w:numPr>
       </w:pPr>
       <w:r>
@@ -2039,7 +2540,7 @@
         <w:pStyle w:val="Compact"/>
         <w:numPr>
           <w:ilvl w:val="0"/>
-          <w:numId w:val="1011"/>
+          <w:numId w:val="1014"/>
         </w:numPr>
       </w:pPr>
       <w:r>
@@ -2061,7 +2562,7 @@
         <w:pStyle w:val="Compact"/>
         <w:numPr>
           <w:ilvl w:val="0"/>
-          <w:numId w:val="1011"/>
+          <w:numId w:val="1014"/>
         </w:numPr>
       </w:pPr>
       <w:r>
@@ -2083,7 +2584,7 @@
         <w:pStyle w:val="Compact"/>
         <w:numPr>
           <w:ilvl w:val="0"/>
-          <w:numId w:val="1011"/>
+          <w:numId w:val="1014"/>
         </w:numPr>
       </w:pPr>
       <w:r>
@@ -2105,7 +2606,7 @@
         <w:pStyle w:val="Compact"/>
         <w:numPr>
           <w:ilvl w:val="0"/>
-          <w:numId w:val="1011"/>
+          <w:numId w:val="1014"/>
         </w:numPr>
       </w:pPr>
       <w:r>
@@ -2127,7 +2628,7 @@
         <w:pStyle w:val="Compact"/>
         <w:numPr>
           <w:ilvl w:val="0"/>
-          <w:numId w:val="1011"/>
+          <w:numId w:val="1014"/>
         </w:numPr>
       </w:pPr>
       <w:r>
@@ -2162,9 +2663,9 @@
         <w:t xml:space="preserve">every prominent metric should tell the learner what to do next.</w:t>
       </w:r>
     </w:p>
-    <w:bookmarkEnd w:id="30"/>
-    <w:bookmarkEnd w:id="31"/>
-    <w:bookmarkStart w:id="35" w:name="recommended-ux-test-plan"/>
+    <w:bookmarkEnd w:id="32"/>
+    <w:bookmarkEnd w:id="33"/>
+    <w:bookmarkStart w:id="37" w:name="recommended-ux-test-plan"/>
     <w:p>
       <w:pPr>
         <w:pStyle w:val="Heading2"/>
@@ -2182,7 +2683,7 @@
         <w:t xml:space="preserve">Recommended UX test plan</w:t>
       </w:r>
     </w:p>
-    <w:bookmarkStart w:id="32" w:name="moderated-usability-sessions"/>
+    <w:bookmarkStart w:id="34" w:name="moderated-usability-sessions"/>
     <w:p>
       <w:pPr>
         <w:pStyle w:val="Heading3"/>
@@ -2213,7 +2714,7 @@
         <w:pStyle w:val="Compact"/>
         <w:numPr>
           <w:ilvl w:val="0"/>
-          <w:numId w:val="1012"/>
+          <w:numId w:val="1015"/>
         </w:numPr>
       </w:pPr>
       <w:r>
@@ -2225,7 +2726,7 @@
         <w:pStyle w:val="Compact"/>
         <w:numPr>
           <w:ilvl w:val="0"/>
-          <w:numId w:val="1012"/>
+          <w:numId w:val="1015"/>
         </w:numPr>
       </w:pPr>
       <w:r>
@@ -2237,7 +2738,7 @@
         <w:pStyle w:val="Compact"/>
         <w:numPr>
           <w:ilvl w:val="0"/>
-          <w:numId w:val="1012"/>
+          <w:numId w:val="1015"/>
         </w:numPr>
       </w:pPr>
       <w:r>
@@ -2249,7 +2750,7 @@
         <w:pStyle w:val="Compact"/>
         <w:numPr>
           <w:ilvl w:val="0"/>
-          <w:numId w:val="1012"/>
+          <w:numId w:val="1015"/>
         </w:numPr>
       </w:pPr>
       <w:r>
@@ -2261,7 +2762,7 @@
         <w:pStyle w:val="Compact"/>
         <w:numPr>
           <w:ilvl w:val="0"/>
-          <w:numId w:val="1012"/>
+          <w:numId w:val="1015"/>
         </w:numPr>
       </w:pPr>
       <w:r>
@@ -2273,7 +2774,7 @@
         <w:pStyle w:val="Compact"/>
         <w:numPr>
           <w:ilvl w:val="0"/>
-          <w:numId w:val="1012"/>
+          <w:numId w:val="1015"/>
         </w:numPr>
       </w:pPr>
       <w:r>
@@ -2285,7 +2786,7 @@
         <w:pStyle w:val="Compact"/>
         <w:numPr>
           <w:ilvl w:val="0"/>
-          <w:numId w:val="1012"/>
+          <w:numId w:val="1015"/>
         </w:numPr>
       </w:pPr>
       <w:r>
@@ -2300,8 +2801,8 @@
         <w:t xml:space="preserve">Measure task completion, first-click success, time, errors, abandonment points, confidence, and the System Usability Scale.</w:t>
       </w:r>
     </w:p>
-    <w:bookmarkEnd w:id="32"/>
-    <w:bookmarkStart w:id="33" w:name="accessibility-checks"/>
+    <w:bookmarkEnd w:id="34"/>
+    <w:bookmarkStart w:id="35" w:name="accessibility-checks"/>
     <w:p>
       <w:pPr>
         <w:pStyle w:val="Heading3"/>
@@ -2324,7 +2825,7 @@
         <w:pStyle w:val="Compact"/>
         <w:numPr>
           <w:ilvl w:val="0"/>
-          <w:numId w:val="1013"/>
+          <w:numId w:val="1016"/>
         </w:numPr>
       </w:pPr>
       <w:r>
@@ -2336,7 +2837,7 @@
         <w:pStyle w:val="Compact"/>
         <w:numPr>
           <w:ilvl w:val="0"/>
-          <w:numId w:val="1013"/>
+          <w:numId w:val="1016"/>
         </w:numPr>
       </w:pPr>
       <w:r>
@@ -2348,7 +2849,7 @@
         <w:pStyle w:val="Compact"/>
         <w:numPr>
           <w:ilvl w:val="0"/>
-          <w:numId w:val="1013"/>
+          <w:numId w:val="1016"/>
         </w:numPr>
       </w:pPr>
       <w:r>
@@ -2360,7 +2861,7 @@
         <w:pStyle w:val="Compact"/>
         <w:numPr>
           <w:ilvl w:val="0"/>
-          <w:numId w:val="1013"/>
+          <w:numId w:val="1016"/>
         </w:numPr>
       </w:pPr>
       <w:r>
@@ -2372,15 +2873,15 @@
         <w:pStyle w:val="Compact"/>
         <w:numPr>
           <w:ilvl w:val="0"/>
-          <w:numId w:val="1013"/>
+          <w:numId w:val="1016"/>
         </w:numPr>
       </w:pPr>
       <w:r>
         <w:t xml:space="preserve">Text/table alternatives for charts.</w:t>
       </w:r>
     </w:p>
-    <w:bookmarkEnd w:id="33"/>
-    <w:bookmarkStart w:id="34" w:name="functional-regression-suite"/>
+    <w:bookmarkEnd w:id="35"/>
+    <w:bookmarkStart w:id="36" w:name="functional-regression-suite"/>
     <w:p>
       <w:pPr>
         <w:pStyle w:val="Heading3"/>
@@ -2403,7 +2904,7 @@
         <w:pStyle w:val="Compact"/>
         <w:numPr>
           <w:ilvl w:val="0"/>
-          <w:numId w:val="1014"/>
+          <w:numId w:val="1017"/>
         </w:numPr>
       </w:pPr>
       <w:r>
@@ -2415,7 +2916,7 @@
         <w:pStyle w:val="Compact"/>
         <w:numPr>
           <w:ilvl w:val="0"/>
-          <w:numId w:val="1014"/>
+          <w:numId w:val="1017"/>
         </w:numPr>
       </w:pPr>
       <w:r>
@@ -2427,7 +2928,7 @@
         <w:pStyle w:val="Compact"/>
         <w:numPr>
           <w:ilvl w:val="0"/>
-          <w:numId w:val="1014"/>
+          <w:numId w:val="1017"/>
         </w:numPr>
       </w:pPr>
       <w:r>
@@ -2439,7 +2940,7 @@
         <w:pStyle w:val="Compact"/>
         <w:numPr>
           <w:ilvl w:val="0"/>
-          <w:numId w:val="1014"/>
+          <w:numId w:val="1017"/>
         </w:numPr>
       </w:pPr>
       <w:r>
@@ -2451,7 +2952,7 @@
         <w:pStyle w:val="Compact"/>
         <w:numPr>
           <w:ilvl w:val="0"/>
-          <w:numId w:val="1014"/>
+          <w:numId w:val="1017"/>
         </w:numPr>
       </w:pPr>
       <w:r>
@@ -2463,7 +2964,7 @@
         <w:pStyle w:val="Compact"/>
         <w:numPr>
           <w:ilvl w:val="0"/>
-          <w:numId w:val="1014"/>
+          <w:numId w:val="1017"/>
         </w:numPr>
       </w:pPr>
       <w:r>
@@ -2475,7 +2976,7 @@
         <w:pStyle w:val="Compact"/>
         <w:numPr>
           <w:ilvl w:val="0"/>
-          <w:numId w:val="1014"/>
+          <w:numId w:val="1017"/>
         </w:numPr>
       </w:pPr>
       <w:r>
@@ -2487,7 +2988,7 @@
         <w:pStyle w:val="Compact"/>
         <w:numPr>
           <w:ilvl w:val="0"/>
-          <w:numId w:val="1014"/>
+          <w:numId w:val="1017"/>
         </w:numPr>
       </w:pPr>
       <w:r>
@@ -2499,7 +3000,7 @@
         <w:pStyle w:val="Compact"/>
         <w:numPr>
           <w:ilvl w:val="0"/>
-          <w:numId w:val="1014"/>
+          <w:numId w:val="1017"/>
         </w:numPr>
       </w:pPr>
       <w:r>
@@ -2511,7 +3012,7 @@
         <w:pStyle w:val="Compact"/>
         <w:numPr>
           <w:ilvl w:val="0"/>
-          <w:numId w:val="1014"/>
+          <w:numId w:val="1017"/>
         </w:numPr>
       </w:pPr>
       <w:r>
@@ -2523,16 +3024,16 @@
         <w:pStyle w:val="Compact"/>
         <w:numPr>
           <w:ilvl w:val="0"/>
-          <w:numId w:val="1014"/>
+          <w:numId w:val="1017"/>
         </w:numPr>
       </w:pPr>
       <w:r>
         <w:t xml:space="preserve">Chrome, Safari, Firefox, and Edge on desktop and mobile breakpoints.</w:t>
       </w:r>
     </w:p>
-    <w:bookmarkEnd w:id="34"/>
-    <w:bookmarkEnd w:id="35"/>
-    <w:bookmarkStart w:id="40" w:name="proposed-delivery-sequence"/>
+    <w:bookmarkEnd w:id="36"/>
+    <w:bookmarkEnd w:id="37"/>
+    <w:bookmarkStart w:id="42" w:name="proposed-delivery-sequence"/>
     <w:p>
       <w:pPr>
         <w:pStyle w:val="Heading2"/>
@@ -2550,7 +3051,7 @@
         <w:t xml:space="preserve">Proposed delivery sequence</w:t>
       </w:r>
     </w:p>
-    <w:bookmarkStart w:id="36" w:name="immediate-stabilization"/>
+    <w:bookmarkStart w:id="38" w:name="immediate-stabilization"/>
     <w:p>
       <w:pPr>
         <w:pStyle w:val="Heading3"/>
@@ -2573,7 +3074,7 @@
         <w:pStyle w:val="Compact"/>
         <w:numPr>
           <w:ilvl w:val="0"/>
-          <w:numId w:val="1015"/>
+          <w:numId w:val="1018"/>
         </w:numPr>
       </w:pPr>
       <w:r>
@@ -2585,7 +3086,7 @@
         <w:pStyle w:val="Compact"/>
         <w:numPr>
           <w:ilvl w:val="0"/>
-          <w:numId w:val="1015"/>
+          <w:numId w:val="1018"/>
         </w:numPr>
       </w:pPr>
       <w:r>
@@ -2597,7 +3098,7 @@
         <w:pStyle w:val="Compact"/>
         <w:numPr>
           <w:ilvl w:val="0"/>
-          <w:numId w:val="1015"/>
+          <w:numId w:val="1018"/>
         </w:numPr>
       </w:pPr>
       <w:r>
@@ -2609,7 +3110,7 @@
         <w:pStyle w:val="Compact"/>
         <w:numPr>
           <w:ilvl w:val="0"/>
-          <w:numId w:val="1015"/>
+          <w:numId w:val="1018"/>
         </w:numPr>
       </w:pPr>
       <w:r>
@@ -2621,15 +3122,15 @@
         <w:pStyle w:val="Compact"/>
         <w:numPr>
           <w:ilvl w:val="0"/>
-          <w:numId w:val="1015"/>
+          <w:numId w:val="1018"/>
         </w:numPr>
       </w:pPr>
       <w:r>
         <w:t xml:space="preserve">Training review and analytics filtering fixes</w:t>
       </w:r>
     </w:p>
-    <w:bookmarkEnd w:id="36"/>
-    <w:bookmarkStart w:id="37" w:name="conversion-and-trust"/>
+    <w:bookmarkEnd w:id="38"/>
+    <w:bookmarkStart w:id="39" w:name="conversion-and-trust"/>
     <w:p>
       <w:pPr>
         <w:pStyle w:val="Heading3"/>
@@ -2652,7 +3153,7 @@
         <w:pStyle w:val="Compact"/>
         <w:numPr>
           <w:ilvl w:val="0"/>
-          <w:numId w:val="1016"/>
+          <w:numId w:val="1019"/>
         </w:numPr>
       </w:pPr>
       <w:r>
@@ -2664,7 +3165,7 @@
         <w:pStyle w:val="Compact"/>
         <w:numPr>
           <w:ilvl w:val="0"/>
-          <w:numId w:val="1016"/>
+          <w:numId w:val="1019"/>
         </w:numPr>
       </w:pPr>
       <w:r>
@@ -2676,7 +3177,7 @@
         <w:pStyle w:val="Compact"/>
         <w:numPr>
           <w:ilvl w:val="0"/>
-          <w:numId w:val="1016"/>
+          <w:numId w:val="1019"/>
         </w:numPr>
       </w:pPr>
       <w:r>
@@ -2688,15 +3189,15 @@
         <w:pStyle w:val="Compact"/>
         <w:numPr>
           <w:ilvl w:val="0"/>
-          <w:numId w:val="1016"/>
+          <w:numId w:val="1019"/>
         </w:numPr>
       </w:pPr>
       <w:r>
         <w:t xml:space="preserve">Receipt reconciliation and clearer support route</w:t>
       </w:r>
     </w:p>
-    <w:bookmarkEnd w:id="37"/>
-    <w:bookmarkStart w:id="38" w:name="guided-learning"/>
+    <w:bookmarkEnd w:id="39"/>
+    <w:bookmarkStart w:id="40" w:name="guided-learning"/>
     <w:p>
       <w:pPr>
         <w:pStyle w:val="Heading3"/>
@@ -2719,7 +3220,7 @@
         <w:pStyle w:val="Compact"/>
         <w:numPr>
           <w:ilvl w:val="0"/>
-          <w:numId w:val="1017"/>
+          <w:numId w:val="1020"/>
         </w:numPr>
       </w:pPr>
       <w:r>
@@ -2731,7 +3232,7 @@
         <w:pStyle w:val="Compact"/>
         <w:numPr>
           <w:ilvl w:val="0"/>
-          <w:numId w:val="1017"/>
+          <w:numId w:val="1020"/>
         </w:numPr>
       </w:pPr>
       <w:r>
@@ -2743,7 +3244,7 @@
         <w:pStyle w:val="Compact"/>
         <w:numPr>
           <w:ilvl w:val="0"/>
-          <w:numId w:val="1017"/>
+          <w:numId w:val="1020"/>
         </w:numPr>
       </w:pPr>
       <w:r>
@@ -2755,15 +3256,15 @@
         <w:pStyle w:val="Compact"/>
         <w:numPr>
           <w:ilvl w:val="0"/>
-          <w:numId w:val="1017"/>
+          <w:numId w:val="1020"/>
         </w:numPr>
       </w:pPr>
       <w:r>
         <w:t xml:space="preserve">Mobile simulator compression and onboarding</w:t>
       </w:r>
     </w:p>
-    <w:bookmarkEnd w:id="38"/>
-    <w:bookmarkStart w:id="39" w:name="ongoing-assurance"/>
+    <w:bookmarkEnd w:id="40"/>
+    <w:bookmarkStart w:id="41" w:name="ongoing-assurance"/>
     <w:p>
       <w:pPr>
         <w:pStyle w:val="Heading3"/>
@@ -2786,7 +3287,7 @@
         <w:pStyle w:val="Compact"/>
         <w:numPr>
           <w:ilvl w:val="0"/>
-          <w:numId w:val="1018"/>
+          <w:numId w:val="1021"/>
         </w:numPr>
       </w:pPr>
       <w:r>
@@ -2798,7 +3299,7 @@
         <w:pStyle w:val="Compact"/>
         <w:numPr>
           <w:ilvl w:val="0"/>
-          <w:numId w:val="1018"/>
+          <w:numId w:val="1021"/>
         </w:numPr>
       </w:pPr>
       <w:r>
@@ -2810,7 +3311,7 @@
         <w:pStyle w:val="Compact"/>
         <w:numPr>
           <w:ilvl w:val="0"/>
-          <w:numId w:val="1018"/>
+          <w:numId w:val="1021"/>
         </w:numPr>
       </w:pPr>
       <w:r>
@@ -2822,43 +3323,43 @@
         <w:pStyle w:val="Compact"/>
         <w:numPr>
           <w:ilvl w:val="0"/>
-          <w:numId w:val="1018"/>
+          <w:numId w:val="1021"/>
         </w:numPr>
       </w:pPr>
       <w:r>
         <w:t xml:space="preserve">Payment and data-security review before enabling live transactions</w:t>
-      </w:r>
-    </w:p>
-    <w:bookmarkEnd w:id="39"/>
-    <w:bookmarkEnd w:id="40"/>
-    <w:bookmarkStart w:id="41" w:name="launch-readiness-statement"/>
-    <w:p>
-      <w:pPr>
-        <w:pStyle w:val="Heading2"/>
-      </w:pPr>
-      <w:r>
-        <w:rPr>
-          <w:rStyle w:val="SectionNumber"/>
-        </w:rPr>
-        <w:t xml:space="preserve">1.10</w:t>
-      </w:r>
-      <w:r>
-        <w:tab/>
-      </w:r>
-      <w:r>
-        <w:t xml:space="preserve">Launch readiness statement</w:t>
-      </w:r>
-    </w:p>
-    <w:p>
-      <w:pPr>
-        <w:pStyle w:val="FirstParagraph"/>
-      </w:pPr>
-      <w:r>
-        <w:t xml:space="preserve">PM Exam Pro’s core experience is working and demonstrates strong potential. After the immediate stabilization items are resolved and retested, the platform should be in a much stronger position for public acquisition: credible catalog promises, trustworthy payment, uninterrupted exam access, and analytics that clearly guide each learner’s next step.</w:t>
       </w:r>
     </w:p>
     <w:bookmarkEnd w:id="41"/>
     <w:bookmarkEnd w:id="42"/>
+    <w:bookmarkStart w:id="43" w:name="launch-readiness-statement"/>
+    <w:p>
+      <w:pPr>
+        <w:pStyle w:val="Heading2"/>
+      </w:pPr>
+      <w:r>
+        <w:rPr>
+          <w:rStyle w:val="SectionNumber"/>
+        </w:rPr>
+        <w:t xml:space="preserve">1.10</w:t>
+      </w:r>
+      <w:r>
+        <w:tab/>
+      </w:r>
+      <w:r>
+        <w:t xml:space="preserve">Launch readiness statement</w:t>
+      </w:r>
+    </w:p>
+    <w:p>
+      <w:pPr>
+        <w:pStyle w:val="FirstParagraph"/>
+      </w:pPr>
+      <w:r>
+        <w:t xml:space="preserve">PM Exam Pro’s core experience is working and demonstrates strong potential. After the immediate stabilization items are resolved and retested, the platform should be in a much stronger position for public acquisition: credible catalog promises, trustworthy payment, uninterrupted exam access, and analytics that clearly guide each learner’s next step.</w:t>
+      </w:r>
+    </w:p>
+    <w:bookmarkEnd w:id="43"/>
+    <w:bookmarkEnd w:id="44"/>
     <w:sectPr>
       <w:footnotePr>
         <w:numRestart w:val="eachSect"/>
@@ -3245,6 +3746,15 @@
     <w:abstractNumId w:val="991"/>
   </w:num>
   <w:num w:numId="1011">
+    <w:abstractNumId w:val="991"/>
+  </w:num>
+  <w:num w:numId="1012">
+    <w:abstractNumId w:val="991"/>
+  </w:num>
+  <w:num w:numId="1013">
+    <w:abstractNumId w:val="991"/>
+  </w:num>
+  <w:num w:numId="1014">
     <w:abstractNumId w:val="99411"/>
     <w:lvlOverride w:ilvl="0">
       <w:startOverride w:val="1"/>
@@ -3274,7 +3784,7 @@
       <w:startOverride w:val="1"/>
     </w:lvlOverride>
   </w:num>
-  <w:num w:numId="1012">
+  <w:num w:numId="1015">
     <w:abstractNumId w:val="99411"/>
     <w:lvlOverride w:ilvl="0">
       <w:startOverride w:val="1"/>
@@ -3304,15 +3814,6 @@
       <w:startOverride w:val="1"/>
     </w:lvlOverride>
   </w:num>
-  <w:num w:numId="1013">
-    <w:abstractNumId w:val="991"/>
-  </w:num>
-  <w:num w:numId="1014">
-    <w:abstractNumId w:val="991"/>
-  </w:num>
-  <w:num w:numId="1015">
-    <w:abstractNumId w:val="991"/>
-  </w:num>
   <w:num w:numId="1016">
     <w:abstractNumId w:val="991"/>
   </w:num>
@@ -3320,6 +3821,15 @@
     <w:abstractNumId w:val="991"/>
   </w:num>
   <w:num w:numId="1018">
+    <w:abstractNumId w:val="991"/>
+  </w:num>
+  <w:num w:numId="1019">
+    <w:abstractNumId w:val="991"/>
+  </w:num>
+  <w:num w:numId="1020">
+    <w:abstractNumId w:val="991"/>
+  </w:num>
+  <w:num w:numId="1021">
     <w:abstractNumId w:val="991"/>
   </w:num>
 </w:numbering>

</xml_diff>